<commit_message>
manuscript: restore three missing spaces after sentence stops
Editing had joined three sentences in the short Discussion: "negative
results.Our study", "clonal signal.The same logic", "footprint.A randomized
trial".

Scanned every prose source for punctuation followed directly by a letter. Fifteen
candidates, three genuine, the rest correct as written and left alone: the E1:E2
ratio name, version strings like 3.1.1, the e.g. and i.e. abbreviations, and a
URL inside an HTML comment. A blanket fix would have broken all of those.

Also checked for double spaces, trailing whitespace and space-before-punctuation.
The only hits were the CRediT placeholder slots, where "Conceptualization: ;" is
deliberately empty pending author initials, and the markdown table-caption
syntax, neither of which is an error.

Co-Authored-By: Claude Opus 5 (1M context) <noreply@anthropic.com>
</commit_message>
<xml_diff>
--- a/manuscript/manuscript_short.docx
+++ b/manuscript/manuscript_short.docx
@@ -1636,7 +1636,7 @@
         <w:t xml:space="preserve">(Fujimoto et al. 2019)</w:t>
       </w:r>
       <w:r>
-        <w:t xml:space="preserve">. Because two prior series reached median depths of 35 and 66 million reads, shallow sequencing does not explain the negative results.Our study adds rigorous controls, a clear denominator, and a defined metric. While past work evaluated 11 to 345 specimens, we jointly analyze 406 cSCC/AK libraries and 7,800 unselected-skin libraries in one pipeline. This changes a simple absence report into a quantified case-control comparison with an effect size. Instead of only scoring viral presence or transcription, we measure productive replication against a calibrated baseline. We anchor this baseline using lesions with confirmed productive infection. We evaluate</w:t>
+        <w:t xml:space="preserve">. Because two prior series reached median depths of 35 and 66 million reads, shallow sequencing does not explain the negative results. Our study adds rigorous controls, a clear denominator, and a defined metric. While past work evaluated 11 to 345 specimens, we jointly analyze 406 cSCC/AK libraries and 7,800 unselected-skin libraries in one pipeline. This changes a simple absence report into a quantified case-control comparison with an effect size. Instead of only scoring viral presence or transcription, we measure productive replication against a calibrated baseline. We anchor this baseline using lesions with confirmed productive infection. We evaluate</w:t>
       </w:r>
       <w:r>
         <w:t xml:space="preserve"> </w:t>
@@ -1674,7 +1674,7 @@
         <w:t xml:space="preserve">(Rehm et al. 2022)</w:t>
       </w:r>
       <w:r>
-        <w:t xml:space="preserve">. Our data measure this exact axis and cannot separate the three.Son and colleagues found elevated beta-HPV activity in sun-exposed skin. This finding does not conflict with our quiet reservoir. Their study observed local activity in keratinocyte clones. Our study used whole biopsies without sorting for ultraviolet exposure. A wide biopsy average dilutes a small clonal signal.The same logic applies to the HPV8-driven expansion of Lrig1⁺ follicular stem cells in actinic keratosis</w:t>
+        <w:t xml:space="preserve">. Our data measure this exact axis and cannot separate the three. Son and colleagues found elevated beta-HPV activity in sun-exposed skin. This finding does not conflict with our quiet reservoir. Their study observed local activity in keratinocyte clones. Our study used whole biopsies without sorting for ultraviolet exposure. A wide biopsy average dilutes a small clonal signal. The same logic applies to the HPV8-driven expansion of Lrig1⁺ follicular stem cells in actinic keratosis</w:t>
       </w:r>
       <w:r>
         <w:t xml:space="preserve"> </w:t>
@@ -1683,7 +1683,7 @@
         <w:t xml:space="preserve">(Morgan et al. 2024)</w:t>
       </w:r>
       <w:r>
-        <w:t xml:space="preserve">. We agree on viral presence, as we recovered trace HPV from 62.5% of AK libraries. An E6-driven stem cell mechanism requires oncogene function, not capsid production. This matches our non-productive footprint.A randomized trial shows that the nine-valent vaccine reduces the burden of actinic keratosis</w:t>
+        <w:t xml:space="preserve">. We agree on viral presence, as we recovered trace HPV from 62.5% of AK libraries. An E6-driven stem cell mechanism requires oncogene function, not capsid production. This matches our non-productive footprint. A randomized trial shows that the nine-valent vaccine reduces the burden of actinic keratosis</w:t>
       </w:r>
       <w:r>
         <w:t xml:space="preserve"> </w:t>

</xml_diff>

<commit_message>
manuscript: re-render the short version after the introduction revision
Picks up the reworked Introduction prose. Also replaces one em-dash, in "396
distinct types—229 of which", with a comma, since the pre-commit hook rejects
them.

Checks after rendering: 3,244 of 3,500 words with back matter excluded, abstract
at 200, longest legend 122 of 125, no unresolved cross-references, no broken
inline R, no British spellings, and no sentence stops left without a following
space.

Co-Authored-By: Claude Opus 5 (1M context) <noreply@anthropic.com>
</commit_message>
<xml_diff>
--- a/manuscript/manuscript_short.docx
+++ b/manuscript/manuscript_short.docx
@@ -97,7 +97,7 @@
         <w:pStyle w:val="FirstParagraph"/>
       </w:pPr>
       <w:r>
-        <w:t xml:space="preserve">Cutaneous beta- and gamma-HPVs behave less like pathogens than like skin flora: acquired early, ubiquitous in healthy adults, and persisting as asymptomatic low-level infections</w:t>
+        <w:t xml:space="preserve">Cutaneous beta- and gamma-HPVs act more like normal skin flora than disease-causing pathogens. They are acquired early in life, are ubiquitous in healthy adults, and persist as quiet, low-level infections</w:t>
       </w:r>
       <w:r>
         <w:t xml:space="preserve"> </w:t>
@@ -106,7 +106,7 @@
         <w:t xml:space="preserve">(Antonsson et al. 2000; Doorbar 2023)</w:t>
       </w:r>
       <w:r>
-        <w:t xml:space="preserve">. At DNA level the reservoir is large and well mapped, with HPV in 61.3% of skin samples in shotgun metagenomics of healthy subjects</w:t>
+        <w:t xml:space="preserve">. At the DNA level, this viral reservoir is large and well-mapped. Shotgun metagenomics detected HPV in 61.3% of healthy skin samples</w:t>
       </w:r>
       <w:r>
         <w:t xml:space="preserve"> </w:t>
@@ -115,10 +115,7 @@
         <w:t xml:space="preserve">(Ma et al. 2014)</w:t>
       </w:r>
       <w:r>
-        <w:t xml:space="preserve"> </w:t>
-      </w:r>
-      <w:r>
-        <w:t xml:space="preserve">and beta-HPV in 92% of adults by skin swab</w:t>
+        <w:t xml:space="preserve">, while skin swabs found beta-HPV in 92% of adults</w:t>
       </w:r>
       <w:r>
         <w:t xml:space="preserve"> </w:t>
@@ -127,7 +124,7 @@
         <w:t xml:space="preserve">(Rollison, Schell, et al. 2019)</w:t>
       </w:r>
       <w:r>
-        <w:t xml:space="preserve">, across a diversity extending to 396 types, 229 of them previously unknown</w:t>
+        <w:t xml:space="preserve">. This viral community is incredibly diverse, spanning 396 distinct types, 229 of which were previously unknown</w:t>
       </w:r>
       <w:r>
         <w:t xml:space="preserve"> </w:t>
@@ -136,7 +133,7 @@
         <w:t xml:space="preserve">(Bzhalava et al. 2014)</w:t>
       </w:r>
       <w:r>
-        <w:t xml:space="preserve">. What these figures cannot say is whether any of that material is transcribed.</w:t>
+        <w:t xml:space="preserve">. However, these DNA figures alone cannot tell us whether any of this genetic material is actively transcribed.</w:t>
       </w:r>
     </w:p>
     <w:p>
@@ -144,7 +141,7 @@
         <w:pStyle w:val="BodyText"/>
       </w:pPr>
       <w:r>
-        <w:t xml:space="preserve">The question matters because beta-HPV is a suspected cofactor in cutaneous squamous cell carcinoma (cSCC), particularly in organ-transplant recipients</w:t>
+        <w:t xml:space="preserve">This question matters because beta-HPV is a suspected cofactor in cutaneous squamous cell carcinoma (cSCC), particularly in organ-transplant recipients</w:t>
       </w:r>
       <w:r>
         <w:t xml:space="preserve"> </w:t>
@@ -153,7 +150,7 @@
         <w:t xml:space="preserve">(Howley and Pfister 2015; Rollison, Viarisio, et al. 2019)</w:t>
       </w:r>
       <w:r>
-        <w:t xml:space="preserve">. Three accounts of its role are live and mutually compatible with the same data. Under</w:t>
+        <w:t xml:space="preserve">. Three distinct, mutually compatible theories explain this role using the same data. Under the</w:t>
       </w:r>
       <w:r>
         <w:t xml:space="preserve"> </w:t>
@@ -162,7 +159,10 @@
         <w:t xml:space="preserve">“hit-and-run”</w:t>
       </w:r>
       <w:r>
-        <w:t xml:space="preserve">, beta-HPV acts early with ultraviolet radiation and is dispensable once the tumour is established</w:t>
+        <w:t xml:space="preserve"> </w:t>
+      </w:r>
+      <w:r>
+        <w:t xml:space="preserve">model, beta-HPV works with ultraviolet radiation during early cancer development but becomes dispensable once the tumor forms</w:t>
       </w:r>
       <w:r>
         <w:t xml:space="preserve"> </w:t>
@@ -171,25 +171,16 @@
         <w:t xml:space="preserve">(Viarisio et al. 2018; Dorfer et al. 2021)</w:t>
       </w:r>
       <w:r>
-        <w:t xml:space="preserve">. Under the protective-immunity account, T-cell immunity to commensal papillomaviruses actively suppresses skin cancer, so viral loss reflects immune selection</w:t>
-      </w:r>
-      <w:r>
-        <w:t xml:space="preserve"> </w:t>
-      </w:r>
-      <w:r>
-        <w:t xml:space="preserve">(Strickley et al. 2019)</w:t>
-      </w:r>
-      <w:r>
-        <w:t xml:space="preserve">; that claim drew a formal exchange in the same journal</w:t>
-      </w:r>
-      <w:r>
-        <w:t xml:space="preserve"> </w:t>
-      </w:r>
-      <w:r>
-        <w:t xml:space="preserve">(Lambert et al. 2021; Strickley et al. 2021)</w:t>
-      </w:r>
-      <w:r>
-        <w:t xml:space="preserve">, and has since been extended to show papillomavirus colonization blocking mutant p53 clone expansion, with beta-HPV lost as those clones expand</w:t>
+        <w:t xml:space="preserve">. Alternatively, the protective-immunity theory suggests T-cell immunity to regular papillomaviruses actively suppresses skin cancer, meaning viral loss reflects immune selection</w:t>
+      </w:r>
+      <w:r>
+        <w:t xml:space="preserve"> </w:t>
+      </w:r>
+      <w:r>
+        <w:t xml:space="preserve">(Strickley et al. 2019, 2021; Lambert et al. 2021)</w:t>
+      </w:r>
+      <w:r>
+        <w:t xml:space="preserve">. This idea now includes evidence that viral colonization blocks mutant p53 clone expansion, with beta-HPV disappearing as those clones grow</w:t>
       </w:r>
       <w:r>
         <w:t xml:space="preserve"> </w:t>
@@ -198,7 +189,7 @@
         <w:t xml:space="preserve">(Son et al. 2025)</w:t>
       </w:r>
       <w:r>
-        <w:t xml:space="preserve">. A third account needs neither premise: the beta-HPV genome represses its own expression through E8^E2, and immortalization of keratinocytes requires that repressor to be inactivated</w:t>
+        <w:t xml:space="preserve">. A third theory requires neither premise, proposing that silence is simply the viral default because the beta-HPV genome uses E8^E2 to repress its own expression, and cell transformation requires inactivating this repressor</w:t>
       </w:r>
       <w:r>
         <w:t xml:space="preserve"> </w:t>
@@ -207,7 +198,7 @@
         <w:t xml:space="preserve">(Rehm et al. 2022)</w:t>
       </w:r>
       <w:r>
-        <w:t xml:space="preserve">, so quiescence may simply be the viral default. All three predict declining viral activity from healthy skin to carcinoma, which is why measuring that decline more precisely cannot separate them.</w:t>
+        <w:t xml:space="preserve">. Ultimately, all three models predict declining viral activity from healthy skin to carcinoma, which is why measuring that decline more precisely cannot separate them.</w:t>
       </w:r>
     </w:p>
     <w:p>
@@ -215,7 +206,19 @@
         <w:pStyle w:val="BodyText"/>
       </w:pPr>
       <w:r>
-        <w:t xml:space="preserve">Whether HPV is transcribed in cutaneous carcinoma has been asked directly, and the answers converge on no: in the original cSCC transcriptome study</w:t>
+        <w:t xml:space="preserve">Whether HPV is transcribed in cutaneous carcinoma has been studied directly, and the answers generally converge on</w:t>
+      </w:r>
+      <w:r>
+        <w:t xml:space="preserve"> </w:t>
+      </w:r>
+      <w:r>
+        <w:t xml:space="preserve">“no.”</w:t>
+      </w:r>
+      <w:r>
+        <w:t xml:space="preserve"> </w:t>
+      </w:r>
+      <w:r>
+        <w:t xml:space="preserve">The original cSCC transcriptome study found no viral transcription</w:t>
       </w:r>
       <w:r>
         <w:t xml:space="preserve"> </w:t>
@@ -224,7 +227,7 @@
         <w:t xml:space="preserve">(Arron et al. 2011)</w:t>
       </w:r>
       <w:r>
-        <w:t xml:space="preserve">, in 12 skin lesions at a median 66 million reads</w:t>
+        <w:t xml:space="preserve">. This was mirrored in a study of 12 skin lesions at a median of 66 million reads</w:t>
       </w:r>
       <w:r>
         <w:t xml:space="preserve"> </w:t>
@@ -233,7 +236,7 @@
         <w:t xml:space="preserve">(Hultin et al. 2019)</w:t>
       </w:r>
       <w:r>
-        <w:t xml:space="preserve">, in 345 post-transplant tumours at 35 million reads with transcription in 15</w:t>
+        <w:t xml:space="preserve">. Similarly, a study of 345 post-transplant tumors at 35 million reads found transcription in only 15 cases</w:t>
       </w:r>
       <w:r>
         <w:t xml:space="preserve"> </w:t>
@@ -242,7 +245,7 @@
         <w:t xml:space="preserve">(Arroyo Mühr, Hultin, and Dillner 2021)</w:t>
       </w:r>
       <w:r>
-        <w:t xml:space="preserve">, and in 23 risk-stratified biopsies with no expression against 64% DNA positivity</w:t>
+        <w:t xml:space="preserve">. Another study of 23 risk-stratified biopsies showed zero viral expression, despite a 64% DNA positivity rate</w:t>
       </w:r>
       <w:r>
         <w:t xml:space="preserve"> </w:t>
@@ -251,7 +254,7 @@
         <w:t xml:space="preserve">(Vandiver et al. 2021)</w:t>
       </w:r>
       <w:r>
-        <w:t xml:space="preserve">; E6/E7 mRNA in situ hybridization agrees, at 0.9% of 225 non-anogenital cutaneous SCC</w:t>
+        <w:t xml:space="preserve">. E6/E7 mRNA in situ hybridization supports these findings, showing expression in just 0.9% of 225 non-anogenital cutaneous SCCs</w:t>
       </w:r>
       <w:r>
         <w:t xml:space="preserve"> </w:t>
@@ -260,7 +263,7 @@
         <w:t xml:space="preserve">(Fujimoto et al. 2019)</w:t>
       </w:r>
       <w:r>
-        <w:t xml:space="preserve">. The literature is not unanimous, since in situ hybridization demonstrated EV-HPV transcripts in 4 of 11 PCR-positive transplant cSCC</w:t>
+        <w:t xml:space="preserve">. The literature is not entirely unanimous, however, as in situ hybridization previously demonstrated EV-HPV transcripts in 4 of 11 PCR-positive transplant cSCCs</w:t>
       </w:r>
       <w:r>
         <w:t xml:space="preserve"> </w:t>
@@ -269,7 +272,7 @@
         <w:t xml:space="preserve">(Purdie et al. 2005)</w:t>
       </w:r>
       <w:r>
-        <w:t xml:space="preserve">. What no study has had is a denominator: these series run from 11 to 345 specimens, four of five are lesion-only with no unselected-skin comparator, the largest is confined to formalin-fixed transplant material, and none scores productive replication.</w:t>
+        <w:t xml:space="preserve">. Critically, what these existing studies lack is a proper denominator. Sample sizes remain small, ranging from only 11 to 345 specimens. Furthermore, four out of five studies looked exclusively at lesions without an unselected-skin comparator. The largest study was limited to formalin-fixed transplant material, and none scored productive replication.</w:t>
       </w:r>
     </w:p>
     <w:p>
@@ -277,7 +280,7 @@
         <w:pStyle w:val="BodyText"/>
       </w:pPr>
       <w:r>
-        <w:t xml:space="preserve">Public archives can supply that denominator, since the non-human reads discarded by standard pipelines carry the signal</w:t>
+        <w:t xml:space="preserve">Public archives can supply that missing denominator. Standard pipelines discard non-human reads, but these discarded sequences carry the viral signal</w:t>
       </w:r>
       <w:r>
         <w:t xml:space="preserve"> </w:t>
@@ -286,7 +289,7 @@
         <w:t xml:space="preserve">(Edgar et al. 2022)</w:t>
       </w:r>
       <w:r>
-        <w:t xml:space="preserve">, an approach already applied to skin</w:t>
+        <w:t xml:space="preserve">. This approach has already been successfully applied to skin studies</w:t>
       </w:r>
       <w:r>
         <w:t xml:space="preserve"> </w:t>
@@ -295,7 +298,7 @@
         <w:t xml:space="preserve">(Leiendecker et al. 2023; Bhargava et al. 2025)</w:t>
       </w:r>
       <w:r>
-        <w:t xml:space="preserve">. It is also booby-trapped: HeLa-derived HPV18 contaminates archived data extensively</w:t>
+        <w:t xml:space="preserve">. However, the method is booby-trapped. HeLa-derived HPV18 contaminates archived data extensively</w:t>
       </w:r>
       <w:r>
         <w:t xml:space="preserve"> </w:t>
@@ -304,7 +307,7 @@
         <w:t xml:space="preserve">(Cantalupo, Katz, and Pipas 2015; Kazemian et al. 2015; Adey et al. 2013)</w:t>
       </w:r>
       <w:r>
-        <w:t xml:space="preserve">, and depth and library chemistry both bound what any survey can detect. Here we re-mine public human RNA-seq across the skin spectrum, asking at what rate cutaneous HPV is transcribed, which types are present, and whether the infection is productive.</w:t>
+        <w:t xml:space="preserve">. Additionally, sequencing depth and library chemistry both limit what any survey can reliably detect. Here, we re-mine public human RNA-seq data across the entire skin spectrum. We ask at what rate cutaneous HPV is transcribed, which specific types are present, and whether the infection is productive.</w:t>
       </w:r>
     </w:p>
     <w:bookmarkEnd w:id="21"/>

</xml_diff>

<commit_message>
manuscript: trim figure legends 1, 4 and 5 to the JID 125-word cap
Legends now carry only how to read each panel; the interpretation stays
in the Results text. Record that AP's Conceptualization role is confirmed.

Co-Authored-By: Claude Opus 5.5 <noreply@anthropic.com>
</commit_message>
<xml_diff>
--- a/manuscript/manuscript_short.docx
+++ b/manuscript/manuscript_short.docx
@@ -955,7 +955,7 @@
               <w:t xml:space="preserve">2</w:t>
             </w:r>
             <w:r>
-              <w:t xml:space="preserve">((E1 + 0.5)/(E2 + 0.5)) for libraries with at least five combined reads; the dashed line is parity. In-vitro material sits far above parity and primary tissue at or below it, with the episomal HPV31-positive HaCaT derivative falling among primary tissue. (</w:t>
+              <w:t xml:space="preserve">((E1 + 0.5)/(E2 + 0.5)), for libraries with at least five combined reads; dashed line, parity. The episomal HPV31-positive HaCaT derivative falls among primary tissue. (</w:t>
             </w:r>
             <w:r>
               <w:rPr>
@@ -965,7 +965,7 @@
               <w:t xml:space="preserve">b</w:t>
             </w:r>
             <w:r>
-              <w:t xml:space="preserve">) Virus-host chimeric junctions, plotted as the fraction falling at a library’s most-supported coordinate pair against the raw junction count. Clustering separates the groups completely; raw counts do not, and run the other way. The dashed gray line is the 0.2 clustering threshold. (</w:t>
+              <w:t xml:space="preserve">) Virus-host chimeric junctions: the fraction at a library’s most-supported coordinate pair against the raw junction count; dashed gray line, the 0.2 clustering threshold. (</w:t>
             </w:r>
             <w:r>
               <w:rPr>
@@ -975,7 +975,7 @@
               <w:t xml:space="preserve">c</w:t>
             </w:r>
             <w:r>
-              <w:t xml:space="preserve">) The ratio rises monotonically with grade across a graded cervical series (SRP252916) of HPV16-positive normal epithelium, high-grade squamous intraepithelial lesion (HSIL) and carcinoma, sequenced under one protocol with no cell line in the series; open circles are libraries (</w:t>
+              <w:t xml:space="preserve">) E1:E2 ratio in a graded HPV16-positive cervical series (SRP252916) of normal epithelium, high-grade squamous intraepithelial lesion (HSIL) and carcinoma, sequenced under one protocol. Open circles, libraries (</w:t>
             </w:r>
             <w:r>
               <w:rPr>
@@ -988,17 +988,7 @@
               <w:t xml:space="preserve"> </w:t>
             </w:r>
             <w:r>
-              <w:t xml:space="preserve">= 3, 6 and 6 by grade; the series’ HPV-negative normal controls returned no HPV and are not plotted) and filled diamonds the arm medians, joined by a solid line, and the dashed line at zero is parity as in (</w:t>
-            </w:r>
-            <w:r>
-              <w:rPr>
-                <w:b/>
-                <w:bCs/>
-              </w:rPr>
-              <w:t xml:space="preserve">a</w:t>
-            </w:r>
-            <w:r>
-              <w:t xml:space="preserve">).</w:t>
+              <w:t xml:space="preserve">= 3, 6 and 6 by grade; the HPV-negative controls returned no HPV and are not plotted); filled diamonds, arm medians joined by a solid line; dashed line, parity.</w:t>
             </w:r>
           </w:p>
           <w:bookmarkEnd w:id="26"/>
@@ -1691,7 +1681,7 @@
               <w:pStyle w:val="ImageCaption"/>
             </w:pPr>
             <w:r>
-              <w:t xml:space="preserve">Figure 4: HPV genus prevalence by sample group. The assigned-type catalog, the detection-level trace catalog, and their union, collapsed from HPV type to genus, with a library contributing to at most one row. Each point is the percentage of that sample group’s libraries in which the genus was detected, as a Beta-Binomial posterior mean under a Beta(0.5, 0.5) prior, and the bar through it is the 95% credible interval; the number above each point is the count of libraries detected. Gray crosses mark a genus never detected in that group, drawn at the axis floor because the</w:t>
+              <w:t xml:space="preserve">Figure 4: HPV genus prevalence by sample group. Rows show the assigned-type catalog, the detection-level trace catalog and their union, collapsed from type to genus; a library contributes to at most one of the first two rows. Each point is the percentage of the group’s libraries carrying the genus (Beta-Binomial posterior mean, Beta(0.5, 0.5) prior), the bar its 95% credible interval, and the number above it the count of libraries. Gray crosses mark a genus never detected in that group, drawn at the floor of the log-scaled</w:t>
             </w:r>
             <w:r>
               <w:t xml:space="preserve"> </w:t>
@@ -1704,7 +1694,7 @@
               <w:t xml:space="preserve">y</w:t>
             </w:r>
             <w:r>
-              <w:t xml:space="preserve">-axis is log-scaled and its lowest tick, labeled 0, is a placeholder for zero. High-risk mucosal alpha types concentrate in cultured and engineered material, the cutaneous beta and gamma genera dominate healthy skin and EV, and productive controls carry the wart-associated alpha and mu types. The trace level is where the healthy-skin beta/gamma reservoir becomes visible, most of it falling below the criterion for a type assignment.</w:t>
+              <w:t xml:space="preserve">-axis, where the tick labeled 0 stands for zero.</w:t>
             </w:r>
           </w:p>
           <w:bookmarkEnd w:id="40"/>
@@ -1864,7 +1854,7 @@
               <w:t xml:space="preserve"> </w:t>
             </w:r>
             <w:r>
-              <w:t xml:space="preserve">by body site (Methods), restricted to skin; the body-site comparison that validates the read-out is</w:t>
+              <w:t xml:space="preserve">by body site, restricted to skin (Methods; body-site validation in</w:t>
             </w:r>
             <w:r>
               <w:t xml:space="preserve"> </w:t>
@@ -1878,7 +1868,7 @@
               </w:r>
             </w:hyperlink>
             <w:r>
-              <w:t xml:space="preserve">. (</w:t>
+              <w:t xml:space="preserve">). (</w:t>
             </w:r>
             <w:r>
               <w:rPr>
@@ -1888,7 +1878,7 @@
               <w:t xml:space="preserve">a</w:t>
             </w:r>
             <w:r>
-              <w:t xml:space="preserve">) The 14 commonest types in the skin reservoir, as a percentage of the 1,735 HPV-positive skin DNA libraries. HPV2 is the only alpha type among them. A co-infected library contributes to more than one genus, so this is composition, not prevalence. The two cells beside each bar are that type’s assigned and detection-level counts among the 7,800 unselected-skin RNA libraries here, shaded only where non-zero; the assigned column is empty throughout. (</w:t>
+              <w:t xml:space="preserve">) The 14 commonest types in the skin reservoir, as a percentage of the 1,735 HPV-positive skin DNA libraries (composition, not prevalence: a co-infected library counts under each type). Beside each bar are the type’s assigned and detection-level counts among the 7,800 unselected-skin RNA libraries, shaded where non-zero. (</w:t>
             </w:r>
             <w:r>
               <w:rPr>
@@ -1920,7 +1910,7 @@
               <w:t xml:space="preserve"> </w:t>
             </w:r>
             <w:r>
-              <w:t xml:space="preserve">+ 1), jittered. The shaded corner is abundant</w:t>
+              <w:t xml:space="preserve">+ 1), jittered. The shaded corner, abundant</w:t>
             </w:r>
             <w:r>
               <w:t xml:space="preserve"> </w:t>
@@ -1936,7 +1926,7 @@
               <w:t xml:space="preserve"> </w:t>
             </w:r>
             <w:r>
-              <w:t xml:space="preserve">productive, the conjunction the reservoir-to-disease inference assumes; HPV2 is its only occupant. The reservoir is present in DNA and near-absent from the assigned RNA catalog.</w:t>
+              <w:t xml:space="preserve">productive, is the conjunction the reservoir-to-disease inference assumes; HPV2 is its only occupant.</w:t>
             </w:r>
           </w:p>
           <w:bookmarkEnd w:id="45"/>

</xml_diff>

<commit_message>
manuscript: add Marko Piirsoo's ORCID
Co-Authored-By: Claude Opus 5 <noreply@anthropic.com>
</commit_message>
<xml_diff>
--- a/manuscript/manuscript_short.docx
+++ b/manuscript/manuscript_short.docx
@@ -2454,7 +2454,7 @@
       </w:r>
     </w:p>
     <w:bookmarkEnd w:id="50"/>
-    <w:bookmarkStart w:id="53" w:name="orcids"/>
+    <w:bookmarkStart w:id="54" w:name="orcids"/>
     <w:p>
       <w:pPr>
         <w:pStyle w:val="Heading2"/>
@@ -2506,11 +2506,22 @@
         <w:pStyle w:val="BodyText"/>
       </w:pPr>
       <w:r>
-        <w:t xml:space="preserve">Marko Piirsoo: [to be completed]</w:t>
-      </w:r>
+        <w:t xml:space="preserve">Marko Piirsoo:</w:t>
+      </w:r>
+      <w:r>
+        <w:t xml:space="preserve"> </w:t>
+      </w:r>
+      <w:hyperlink r:id="rId53">
+        <w:r>
+          <w:rPr>
+            <w:rStyle w:val="Hyperlink"/>
+          </w:rPr>
+          <w:t xml:space="preserve">https://orcid.org/0000-0002-9447-1350</w:t>
+        </w:r>
+      </w:hyperlink>
     </w:p>
-    <w:bookmarkEnd w:id="53"/>
-    <w:bookmarkStart w:id="54" w:name="ethics-statement"/>
+    <w:bookmarkEnd w:id="54"/>
+    <w:bookmarkStart w:id="55" w:name="ethics-statement"/>
     <w:p>
       <w:pPr>
         <w:pStyle w:val="Heading2"/>
@@ -2527,8 +2538,8 @@
         <w:t xml:space="preserve">This study analyzed only publicly archived, de-identified human sequencing data retrieved from the NCBI Sequence Read Archive, and generated no new human or animal material. Institutional review board approval and informed consent were therefore not required for the work reported here. Ethical approval and participant consent for the primary studies were the responsibility of their submitting investigators and are recorded in the corresponding BioProject entries.</w:t>
       </w:r>
     </w:p>
-    <w:bookmarkEnd w:id="54"/>
-    <w:bookmarkStart w:id="57" w:name="data-availability-statement"/>
+    <w:bookmarkEnd w:id="55"/>
+    <w:bookmarkStart w:id="58" w:name="data-availability-statement"/>
     <w:p>
       <w:pPr>
         <w:pStyle w:val="Heading2"/>
@@ -2547,7 +2558,7 @@
       <w:r>
         <w:t xml:space="preserve"> </w:t>
       </w:r>
-      <w:hyperlink r:id="rId55">
+      <w:hyperlink r:id="rId56">
         <w:r>
           <w:rPr>
             <w:rStyle w:val="Hyperlink"/>
@@ -2561,7 +2572,7 @@
       <w:r>
         <w:t xml:space="preserve"> </w:t>
       </w:r>
-      <w:hyperlink r:id="rId56">
+      <w:hyperlink r:id="rId57">
         <w:r>
           <w:rPr>
             <w:rStyle w:val="Hyperlink"/>
@@ -2573,8 +2584,8 @@
         <w:t xml:space="preserve">) and NCBI RefSeq. No new sequencing data were generated.</w:t>
       </w:r>
     </w:p>
-    <w:bookmarkEnd w:id="57"/>
-    <w:bookmarkStart w:id="58" w:name="conflict-of-interest"/>
+    <w:bookmarkEnd w:id="58"/>
+    <w:bookmarkStart w:id="59" w:name="conflict-of-interest"/>
     <w:p>
       <w:pPr>
         <w:pStyle w:val="Heading2"/>
@@ -2591,8 +2602,8 @@
         <w:t xml:space="preserve">The authors state no conflict of interest.</w:t>
       </w:r>
     </w:p>
-    <w:bookmarkEnd w:id="58"/>
-    <w:bookmarkStart w:id="59" w:name="acknowledgments"/>
+    <w:bookmarkEnd w:id="59"/>
+    <w:bookmarkStart w:id="60" w:name="acknowledgments"/>
     <w:p>
       <w:pPr>
         <w:pStyle w:val="Heading2"/>
@@ -2625,8 +2636,8 @@
         <w:t xml:space="preserve">The computations were performed on the High Performance Computing Center of the University of Tartu. We thank the submitting investigators of the studies re-analyzed here, whose deposition of raw sequencing data to public archives made this work possible.</w:t>
       </w:r>
     </w:p>
-    <w:bookmarkEnd w:id="59"/>
-    <w:bookmarkStart w:id="60" w:name="author-contributions-statement"/>
+    <w:bookmarkEnd w:id="60"/>
+    <w:bookmarkStart w:id="61" w:name="author-contributions-statement"/>
     <w:p>
       <w:pPr>
         <w:pStyle w:val="Heading2"/>
@@ -2643,8 +2654,8 @@
         <w:t xml:space="preserve">[To be completed, CRediT-compliant.] Conceptualization: AP; Data Curation: ; Formal Analysis: ; Funding Acquisition: ; Investigation: ; Methodology: ; Project Administration: ; Resources: ; Software: ; Supervision: ; Validation: AP; Visualization: ; Writing - Original Draft Preparation: ; Writing - Review and Editing: AP.</w:t>
       </w:r>
     </w:p>
-    <w:bookmarkEnd w:id="60"/>
-    <w:bookmarkStart w:id="61" w:name="declaration-of-generative-ai-use"/>
+    <w:bookmarkEnd w:id="61"/>
+    <w:bookmarkStart w:id="62" w:name="declaration-of-generative-ai-use"/>
     <w:p>
       <w:pPr>
         <w:pStyle w:val="Heading2"/>
@@ -2661,8 +2672,8 @@
         <w:t xml:space="preserve">During this work the authors used Claude (Anthropic) to assist with writing and debugging the analysis pipeline and statistical code, and with editing the manuscript text, and Microsoft Copilot to help draft review comments on the manuscript. The authors reviewed and edited all output and take full responsibility for the content of the publication.</w:t>
       </w:r>
     </w:p>
-    <w:bookmarkEnd w:id="61"/>
-    <w:bookmarkStart w:id="163" w:name="references"/>
+    <w:bookmarkEnd w:id="62"/>
+    <w:bookmarkStart w:id="164" w:name="references"/>
     <w:p>
       <w:pPr>
         <w:pStyle w:val="Heading2"/>
@@ -2671,8 +2682,8 @@
         <w:t xml:space="preserve">References</w:t>
       </w:r>
     </w:p>
-    <w:bookmarkStart w:id="162" w:name="refs"/>
-    <w:bookmarkStart w:id="63" w:name="ref-adey2013"/>
+    <w:bookmarkStart w:id="163" w:name="refs"/>
+    <w:bookmarkStart w:id="64" w:name="ref-adey2013"/>
     <w:p>
       <w:pPr>
         <w:pStyle w:val="Bibliography"/>
@@ -2683,7 +2694,7 @@
       <w:r>
         <w:t xml:space="preserve"> </w:t>
       </w:r>
-      <w:hyperlink r:id="rId62">
+      <w:hyperlink r:id="rId63">
         <w:r>
           <w:rPr>
             <w:rStyle w:val="Hyperlink"/>
@@ -2719,8 +2730,8 @@
         <w:t xml:space="preserve">. Nature. 2013;500:207–11</w:t>
       </w:r>
     </w:p>
-    <w:bookmarkEnd w:id="63"/>
-    <w:bookmarkStart w:id="65" w:name="ref-antonsson2000"/>
+    <w:bookmarkEnd w:id="64"/>
+    <w:bookmarkStart w:id="66" w:name="ref-antonsson2000"/>
     <w:p>
       <w:pPr>
         <w:pStyle w:val="Bibliography"/>
@@ -2731,7 +2742,7 @@
       <w:r>
         <w:t xml:space="preserve"> </w:t>
       </w:r>
-      <w:hyperlink r:id="rId64">
+      <w:hyperlink r:id="rId65">
         <w:r>
           <w:rPr>
             <w:rStyle w:val="Hyperlink"/>
@@ -2743,8 +2754,8 @@
         <w:t xml:space="preserve">. Journal of Virology. 2000;74(24):11636–41</w:t>
       </w:r>
     </w:p>
-    <w:bookmarkEnd w:id="65"/>
-    <w:bookmarkStart w:id="67" w:name="ref-arron2011"/>
+    <w:bookmarkEnd w:id="66"/>
+    <w:bookmarkStart w:id="68" w:name="ref-arron2011"/>
     <w:p>
       <w:pPr>
         <w:pStyle w:val="Bibliography"/>
@@ -2755,7 +2766,7 @@
       <w:r>
         <w:t xml:space="preserve"> </w:t>
       </w:r>
-      <w:hyperlink r:id="rId66">
+      <w:hyperlink r:id="rId67">
         <w:r>
           <w:rPr>
             <w:rStyle w:val="Hyperlink"/>
@@ -2767,8 +2778,8 @@
         <w:t xml:space="preserve">. Journal of Investigative Dermatology. 2011;131(8):1745–53</w:t>
       </w:r>
     </w:p>
-    <w:bookmarkEnd w:id="67"/>
-    <w:bookmarkStart w:id="69" w:name="ref-arroyomuhr2021"/>
+    <w:bookmarkEnd w:id="68"/>
+    <w:bookmarkStart w:id="70" w:name="ref-arroyomuhr2021"/>
     <w:p>
       <w:pPr>
         <w:pStyle w:val="Bibliography"/>
@@ -2779,7 +2790,7 @@
       <w:r>
         <w:t xml:space="preserve"> </w:t>
       </w:r>
-      <w:hyperlink r:id="rId68">
+      <w:hyperlink r:id="rId69">
         <w:r>
           <w:rPr>
             <w:rStyle w:val="Hyperlink"/>
@@ -2791,8 +2802,8 @@
         <w:t xml:space="preserve">. International Journal of Cancer. 2021;149(6):1341–7</w:t>
       </w:r>
     </w:p>
-    <w:bookmarkEnd w:id="69"/>
-    <w:bookmarkStart w:id="71" w:name="ref-asplund2019"/>
+    <w:bookmarkEnd w:id="70"/>
+    <w:bookmarkStart w:id="72" w:name="ref-asplund2019"/>
     <w:p>
       <w:pPr>
         <w:pStyle w:val="Bibliography"/>
@@ -2803,7 +2814,7 @@
       <w:r>
         <w:t xml:space="preserve"> </w:t>
       </w:r>
-      <w:hyperlink r:id="rId70">
+      <w:hyperlink r:id="rId71">
         <w:r>
           <w:rPr>
             <w:rStyle w:val="Hyperlink"/>
@@ -2815,8 +2826,8 @@
         <w:t xml:space="preserve">. Clinical Microbiology and Infection. 2019;25(10):1277–85</w:t>
       </w:r>
     </w:p>
-    <w:bookmarkEnd w:id="71"/>
-    <w:bookmarkStart w:id="73" w:name="ref-bhargava2025"/>
+    <w:bookmarkEnd w:id="72"/>
+    <w:bookmarkStart w:id="74" w:name="ref-bhargava2025"/>
     <w:p>
       <w:pPr>
         <w:pStyle w:val="Bibliography"/>
@@ -2827,7 +2838,7 @@
       <w:r>
         <w:t xml:space="preserve"> </w:t>
       </w:r>
-      <w:hyperlink r:id="rId72">
+      <w:hyperlink r:id="rId73">
         <w:r>
           <w:rPr>
             <w:rStyle w:val="Hyperlink"/>
@@ -2863,8 +2874,8 @@
         <w:t xml:space="preserve">. Physiological Genomics. 2025;57(5):343–56</w:t>
       </w:r>
     </w:p>
-    <w:bookmarkEnd w:id="73"/>
-    <w:bookmarkStart w:id="75" w:name="ref-bruyere2026"/>
+    <w:bookmarkEnd w:id="74"/>
+    <w:bookmarkStart w:id="76" w:name="ref-bruyere2026"/>
     <w:p>
       <w:pPr>
         <w:pStyle w:val="Bibliography"/>
@@ -2875,7 +2886,7 @@
       <w:r>
         <w:t xml:space="preserve"> </w:t>
       </w:r>
-      <w:hyperlink r:id="rId74">
+      <w:hyperlink r:id="rId75">
         <w:r>
           <w:rPr>
             <w:rStyle w:val="Hyperlink"/>
@@ -2887,8 +2898,8 @@
         <w:t xml:space="preserve">. Journal of Investigative Dermatology. 2026;146(7):1770–86</w:t>
       </w:r>
     </w:p>
-    <w:bookmarkEnd w:id="75"/>
-    <w:bookmarkStart w:id="77" w:name="ref-bzhalava2014"/>
+    <w:bookmarkEnd w:id="76"/>
+    <w:bookmarkStart w:id="78" w:name="ref-bzhalava2014"/>
     <w:p>
       <w:pPr>
         <w:pStyle w:val="Bibliography"/>
@@ -2899,7 +2910,7 @@
       <w:r>
         <w:t xml:space="preserve"> </w:t>
       </w:r>
-      <w:hyperlink r:id="rId76">
+      <w:hyperlink r:id="rId77">
         <w:r>
           <w:rPr>
             <w:rStyle w:val="Hyperlink"/>
@@ -2911,8 +2922,8 @@
         <w:t xml:space="preserve">. Scientific Reports. 2014;4:5807</w:t>
       </w:r>
     </w:p>
-    <w:bookmarkEnd w:id="77"/>
-    <w:bookmarkStart w:id="79" w:name="ref-cantalupo2015"/>
+    <w:bookmarkEnd w:id="78"/>
+    <w:bookmarkStart w:id="80" w:name="ref-cantalupo2015"/>
     <w:p>
       <w:pPr>
         <w:pStyle w:val="Bibliography"/>
@@ -2923,7 +2934,7 @@
       <w:r>
         <w:t xml:space="preserve"> </w:t>
       </w:r>
-      <w:hyperlink r:id="rId78">
+      <w:hyperlink r:id="rId79">
         <w:r>
           <w:rPr>
             <w:rStyle w:val="Hyperlink"/>
@@ -2971,8 +2982,8 @@
         <w:t xml:space="preserve">. Journal of Virology. 2015;89(8):4051–7</w:t>
       </w:r>
     </w:p>
-    <w:bookmarkEnd w:id="79"/>
-    <w:bookmarkStart w:id="81" w:name="ref-cantalupo2019"/>
+    <w:bookmarkEnd w:id="80"/>
+    <w:bookmarkStart w:id="82" w:name="ref-cantalupo2019"/>
     <w:p>
       <w:pPr>
         <w:pStyle w:val="Bibliography"/>
@@ -2983,7 +2994,7 @@
       <w:r>
         <w:t xml:space="preserve"> </w:t>
       </w:r>
-      <w:hyperlink r:id="rId80">
+      <w:hyperlink r:id="rId81">
         <w:r>
           <w:rPr>
             <w:rStyle w:val="Hyperlink"/>
@@ -3019,8 +3030,8 @@
         <w:t xml:space="preserve">. Current Opinion in Virology. 2019;39:41–8</w:t>
       </w:r>
     </w:p>
-    <w:bookmarkEnd w:id="81"/>
-    <w:bookmarkStart w:id="83" w:name="ref-chen2018"/>
+    <w:bookmarkEnd w:id="82"/>
+    <w:bookmarkStart w:id="84" w:name="ref-chen2018"/>
     <w:p>
       <w:pPr>
         <w:pStyle w:val="Bibliography"/>
@@ -3031,7 +3042,7 @@
       <w:r>
         <w:t xml:space="preserve"> </w:t>
       </w:r>
-      <w:hyperlink r:id="rId82">
+      <w:hyperlink r:id="rId83">
         <w:r>
           <w:rPr>
             <w:rStyle w:val="Hyperlink"/>
@@ -3067,8 +3078,8 @@
         <w:t xml:space="preserve">. Bioinformatics. 2018;34(17):i884–90</w:t>
       </w:r>
     </w:p>
-    <w:bookmarkEnd w:id="83"/>
-    <w:bookmarkStart w:id="85" w:name="ref-chikhi2024"/>
+    <w:bookmarkEnd w:id="84"/>
+    <w:bookmarkStart w:id="86" w:name="ref-chikhi2024"/>
     <w:p>
       <w:pPr>
         <w:pStyle w:val="Bibliography"/>
@@ -3079,7 +3090,7 @@
       <w:r>
         <w:t xml:space="preserve"> </w:t>
       </w:r>
-      <w:hyperlink r:id="rId84">
+      <w:hyperlink r:id="rId85">
         <w:r>
           <w:rPr>
             <w:rStyle w:val="Hyperlink"/>
@@ -3091,8 +3102,8 @@
         <w:t xml:space="preserve">. bioRxiv. 2024;</w:t>
       </w:r>
     </w:p>
-    <w:bookmarkEnd w:id="85"/>
-    <w:bookmarkStart w:id="87" w:name="ref-danecek2021"/>
+    <w:bookmarkEnd w:id="86"/>
+    <w:bookmarkStart w:id="88" w:name="ref-danecek2021"/>
     <w:p>
       <w:pPr>
         <w:pStyle w:val="Bibliography"/>
@@ -3103,7 +3114,7 @@
       <w:r>
         <w:t xml:space="preserve"> </w:t>
       </w:r>
-      <w:hyperlink r:id="rId86">
+      <w:hyperlink r:id="rId87">
         <w:r>
           <w:rPr>
             <w:rStyle w:val="Hyperlink"/>
@@ -3151,8 +3162,8 @@
         <w:t xml:space="preserve">. GigaScience. 2021;10(2):giab008</w:t>
       </w:r>
     </w:p>
-    <w:bookmarkEnd w:id="87"/>
-    <w:bookmarkStart w:id="89" w:name="ref-devitt2019"/>
+    <w:bookmarkEnd w:id="88"/>
+    <w:bookmarkStart w:id="90" w:name="ref-devitt2019"/>
     <w:p>
       <w:pPr>
         <w:pStyle w:val="Bibliography"/>
@@ -3163,7 +3174,7 @@
       <w:r>
         <w:t xml:space="preserve"> </w:t>
       </w:r>
-      <w:hyperlink r:id="rId88">
+      <w:hyperlink r:id="rId89">
         <w:r>
           <w:rPr>
             <w:rStyle w:val="Hyperlink"/>
@@ -3223,8 +3234,8 @@
         <w:t xml:space="preserve">. Virology. 2019;537:14–9</w:t>
       </w:r>
     </w:p>
-    <w:bookmarkEnd w:id="89"/>
-    <w:bookmarkStart w:id="91" w:name="ref-ditommaso2017"/>
+    <w:bookmarkEnd w:id="90"/>
+    <w:bookmarkStart w:id="92" w:name="ref-ditommaso2017"/>
     <w:p>
       <w:pPr>
         <w:pStyle w:val="Bibliography"/>
@@ -3235,7 +3246,7 @@
       <w:r>
         <w:t xml:space="preserve"> </w:t>
       </w:r>
-      <w:hyperlink r:id="rId90">
+      <w:hyperlink r:id="rId91">
         <w:r>
           <w:rPr>
             <w:rStyle w:val="Hyperlink"/>
@@ -3247,8 +3258,8 @@
         <w:t xml:space="preserve">. Nature Biotechnology. 2017;35(4):316–9</w:t>
       </w:r>
     </w:p>
-    <w:bookmarkEnd w:id="91"/>
-    <w:bookmarkStart w:id="93" w:name="ref-dobin2013"/>
+    <w:bookmarkEnd w:id="92"/>
+    <w:bookmarkStart w:id="94" w:name="ref-dobin2013"/>
     <w:p>
       <w:pPr>
         <w:pStyle w:val="Bibliography"/>
@@ -3259,7 +3270,7 @@
       <w:r>
         <w:t xml:space="preserve"> </w:t>
       </w:r>
-      <w:hyperlink r:id="rId92">
+      <w:hyperlink r:id="rId93">
         <w:r>
           <w:rPr>
             <w:rStyle w:val="Hyperlink"/>
@@ -3299,63 +3310,63 @@
       </w:hyperlink>
       <w:r>
         <w:t xml:space="preserve">. Bioinformatics. 2013;29(1):15–21</w:t>
-      </w:r>
-    </w:p>
-    <w:bookmarkEnd w:id="93"/>
-    <w:bookmarkStart w:id="94" w:name="ref-doorbar2023"/>
-    <w:p>
-      <w:pPr>
-        <w:pStyle w:val="Bibliography"/>
-      </w:pPr>
-      <w:r>
-        <w:t xml:space="preserve">Doorbar J. The human papillomavirus twilight zone: Latency, immune control and subclinical infection. Tumour Virus Research. 2023;16:200268</w:t>
       </w:r>
     </w:p>
     <w:bookmarkEnd w:id="94"/>
-    <w:bookmarkStart w:id="95" w:name="ref-doorbar2012"/>
+    <w:bookmarkStart w:id="95" w:name="ref-doorbar2023"/>
     <w:p>
       <w:pPr>
         <w:pStyle w:val="Bibliography"/>
       </w:pPr>
       <w:r>
-        <w:t xml:space="preserve">Doorbar J, Quint W, Banks L, Bravo IG, Stoler M, Broker TR, et al. The biology and life-cycle of human papillomaviruses. Vaccine. 2012;30(Suppl 5):F55–70</w:t>
+        <w:t xml:space="preserve">Doorbar J. The human papillomavirus twilight zone: Latency, immune control and subclinical infection. Tumour Virus Research. 2023;16:200268</w:t>
       </w:r>
     </w:p>
     <w:bookmarkEnd w:id="95"/>
-    <w:bookmarkStart w:id="96" w:name="ref-dorfer2021"/>
+    <w:bookmarkStart w:id="96" w:name="ref-doorbar2012"/>
     <w:p>
       <w:pPr>
         <w:pStyle w:val="Bibliography"/>
       </w:pPr>
       <w:r>
-        <w:t xml:space="preserve">Dorfer S, Strasser K, Schröckenfuchs G, Bonelli M, Bauer W, Kittler H, et al.</w:t>
-      </w:r>
-      <w:r>
-        <w:t xml:space="preserve"> </w:t>
-      </w:r>
-      <w:r>
-        <w:t xml:space="preserve">MmuPV1</w:t>
-      </w:r>
-      <w:r>
-        <w:t xml:space="preserve"> </w:t>
-      </w:r>
-      <w:r>
-        <w:t xml:space="preserve">is a key driver of skin cancer development upon immunosuppression. American Journal of Transplantation. 2021;21(2):525–39</w:t>
+        <w:t xml:space="preserve">Doorbar J, Quint W, Banks L, Bravo IG, Stoler M, Broker TR, et al. The biology and life-cycle of human papillomaviruses. Vaccine. 2012;30(Suppl 5):F55–70</w:t>
       </w:r>
     </w:p>
     <w:bookmarkEnd w:id="96"/>
-    <w:bookmarkStart w:id="98" w:name="ref-edgar2022"/>
+    <w:bookmarkStart w:id="97" w:name="ref-dorfer2021"/>
     <w:p>
       <w:pPr>
         <w:pStyle w:val="Bibliography"/>
       </w:pPr>
       <w:r>
+        <w:t xml:space="preserve">Dorfer S, Strasser K, Schröckenfuchs G, Bonelli M, Bauer W, Kittler H, et al.</w:t>
+      </w:r>
+      <w:r>
+        <w:t xml:space="preserve"> </w:t>
+      </w:r>
+      <w:r>
+        <w:t xml:space="preserve">MmuPV1</w:t>
+      </w:r>
+      <w:r>
+        <w:t xml:space="preserve"> </w:t>
+      </w:r>
+      <w:r>
+        <w:t xml:space="preserve">is a key driver of skin cancer development upon immunosuppression. American Journal of Transplantation. 2021;21(2):525–39</w:t>
+      </w:r>
+    </w:p>
+    <w:bookmarkEnd w:id="97"/>
+    <w:bookmarkStart w:id="99" w:name="ref-edgar2022"/>
+    <w:p>
+      <w:pPr>
+        <w:pStyle w:val="Bibliography"/>
+      </w:pPr>
+      <w:r>
         <w:t xml:space="preserve">Edgar RC, Taylor B, Lin V, Altman T, Barbera P, Meleshko D, et al.</w:t>
       </w:r>
       <w:r>
         <w:t xml:space="preserve"> </w:t>
       </w:r>
-      <w:hyperlink r:id="rId97">
+      <w:hyperlink r:id="rId98">
         <w:r>
           <w:rPr>
             <w:rStyle w:val="Hyperlink"/>
@@ -3367,8 +3378,8 @@
         <w:t xml:space="preserve">. Nature. 2022;602:142–7</w:t>
       </w:r>
     </w:p>
-    <w:bookmarkEnd w:id="98"/>
-    <w:bookmarkStart w:id="100" w:name="ref-fujimoto2019"/>
+    <w:bookmarkEnd w:id="99"/>
+    <w:bookmarkStart w:id="101" w:name="ref-fujimoto2019"/>
     <w:p>
       <w:pPr>
         <w:pStyle w:val="Bibliography"/>
@@ -3379,7 +3390,7 @@
       <w:r>
         <w:t xml:space="preserve"> </w:t>
       </w:r>
-      <w:hyperlink r:id="rId99">
+      <w:hyperlink r:id="rId100">
         <w:r>
           <w:rPr>
             <w:rStyle w:val="Hyperlink"/>
@@ -3451,8 +3462,8 @@
         <w:t xml:space="preserve">. The American Journal of Dermatopathology. 2019;41(3):205–10</w:t>
       </w:r>
     </w:p>
-    <w:bookmarkEnd w:id="100"/>
-    <w:bookmarkStart w:id="102" w:name="ref-gihawi2023"/>
+    <w:bookmarkEnd w:id="101"/>
+    <w:bookmarkStart w:id="103" w:name="ref-gihawi2023"/>
     <w:p>
       <w:pPr>
         <w:pStyle w:val="Bibliography"/>
@@ -3463,7 +3474,7 @@
       <w:r>
         <w:t xml:space="preserve"> </w:t>
       </w:r>
-      <w:hyperlink r:id="rId101">
+      <w:hyperlink r:id="rId102">
         <w:r>
           <w:rPr>
             <w:rStyle w:val="Hyperlink"/>
@@ -3475,8 +3486,8 @@
         <w:t xml:space="preserve">. mBio. 2023;14(5):e0160723</w:t>
       </w:r>
     </w:p>
-    <w:bookmarkEnd w:id="102"/>
-    <w:bookmarkStart w:id="104" w:name="ref-rstanarm"/>
+    <w:bookmarkEnd w:id="103"/>
+    <w:bookmarkStart w:id="105" w:name="ref-rstanarm"/>
     <w:p>
       <w:pPr>
         <w:pStyle w:val="Bibliography"/>
@@ -3520,7 +3531,7 @@
       <w:r>
         <w:t xml:space="preserve"> </w:t>
       </w:r>
-      <w:hyperlink r:id="rId103">
+      <w:hyperlink r:id="rId104">
         <w:r>
           <w:rPr>
             <w:rStyle w:val="Hyperlink"/>
@@ -3529,8 +3540,8 @@
         </w:r>
       </w:hyperlink>
     </w:p>
-    <w:bookmarkEnd w:id="104"/>
-    <w:bookmarkStart w:id="105" w:name="ref-howley2015"/>
+    <w:bookmarkEnd w:id="105"/>
+    <w:bookmarkStart w:id="106" w:name="ref-howley2015"/>
     <w:p>
       <w:pPr>
         <w:pStyle w:val="Bibliography"/>
@@ -3539,8 +3550,8 @@
         <w:t xml:space="preserve">Howley PM, Pfister HJ. Beta genus papillomaviruses and skin cancer. Virology. 2015;479-480:290–6</w:t>
       </w:r>
     </w:p>
-    <w:bookmarkEnd w:id="105"/>
-    <w:bookmarkStart w:id="107" w:name="ref-hultin2019"/>
+    <w:bookmarkEnd w:id="106"/>
+    <w:bookmarkStart w:id="108" w:name="ref-hultin2019"/>
     <w:p>
       <w:pPr>
         <w:pStyle w:val="Bibliography"/>
@@ -3551,7 +3562,7 @@
       <w:r>
         <w:t xml:space="preserve"> </w:t>
       </w:r>
-      <w:hyperlink r:id="rId106">
+      <w:hyperlink r:id="rId107">
         <w:r>
           <w:rPr>
             <w:rStyle w:val="Hyperlink"/>
@@ -3575,8 +3586,8 @@
         <w:t xml:space="preserve">. PLOS ONE. 2019;14(5):e0217942</w:t>
       </w:r>
     </w:p>
-    <w:bookmarkEnd w:id="107"/>
-    <w:bookmarkStart w:id="109" w:name="ref-kazemian2015"/>
+    <w:bookmarkEnd w:id="108"/>
+    <w:bookmarkStart w:id="110" w:name="ref-kazemian2015"/>
     <w:p>
       <w:pPr>
         <w:pStyle w:val="Bibliography"/>
@@ -3587,7 +3598,7 @@
       <w:r>
         <w:t xml:space="preserve"> </w:t>
       </w:r>
-      <w:hyperlink r:id="rId108">
+      <w:hyperlink r:id="rId109">
         <w:r>
           <w:rPr>
             <w:rStyle w:val="Hyperlink"/>
@@ -3635,8 +3646,8 @@
         <w:t xml:space="preserve">. Journal of Virology. 2015;89(17):8967–73</w:t>
       </w:r>
     </w:p>
-    <w:bookmarkEnd w:id="109"/>
-    <w:bookmarkStart w:id="111" w:name="ref-lambert2021"/>
+    <w:bookmarkEnd w:id="110"/>
+    <w:bookmarkStart w:id="112" w:name="ref-lambert2021"/>
     <w:p>
       <w:pPr>
         <w:pStyle w:val="Bibliography"/>
@@ -3647,7 +3658,7 @@
       <w:r>
         <w:t xml:space="preserve"> </w:t>
       </w:r>
-      <w:hyperlink r:id="rId110">
+      <w:hyperlink r:id="rId111">
         <w:r>
           <w:rPr>
             <w:rStyle w:val="Hyperlink"/>
@@ -3659,8 +3670,8 @@
         <w:t xml:space="preserve">. Nature. 2021;588(7838):E20–1</w:t>
       </w:r>
     </w:p>
-    <w:bookmarkEnd w:id="111"/>
-    <w:bookmarkStart w:id="113" w:name="ref-leiendecker2023"/>
+    <w:bookmarkEnd w:id="112"/>
+    <w:bookmarkStart w:id="114" w:name="ref-leiendecker2023"/>
     <w:p>
       <w:pPr>
         <w:pStyle w:val="Bibliography"/>
@@ -3671,7 +3682,7 @@
       <w:r>
         <w:t xml:space="preserve"> </w:t>
       </w:r>
-      <w:hyperlink r:id="rId112">
+      <w:hyperlink r:id="rId113">
         <w:r>
           <w:rPr>
             <w:rStyle w:val="Hyperlink"/>
@@ -3701,8 +3712,8 @@
         <w:t xml:space="preserve">. Cancer Discovery. 2023;13(1):70–84</w:t>
       </w:r>
     </w:p>
-    <w:bookmarkEnd w:id="113"/>
-    <w:bookmarkStart w:id="115" w:name="ref-leinonen2011"/>
+    <w:bookmarkEnd w:id="114"/>
+    <w:bookmarkStart w:id="116" w:name="ref-leinonen2011"/>
     <w:p>
       <w:pPr>
         <w:pStyle w:val="Bibliography"/>
@@ -3713,7 +3724,7 @@
       <w:r>
         <w:t xml:space="preserve"> </w:t>
       </w:r>
-      <w:hyperlink r:id="rId114">
+      <w:hyperlink r:id="rId115">
         <w:r>
           <w:rPr>
             <w:rStyle w:val="Hyperlink"/>
@@ -3737,8 +3748,8 @@
         <w:t xml:space="preserve">. Nucleic Acids Research. 2011;39(Database issue):D19–21</w:t>
       </w:r>
     </w:p>
-    <w:bookmarkEnd w:id="115"/>
-    <w:bookmarkStart w:id="117" w:name="ref-liao2014"/>
+    <w:bookmarkEnd w:id="116"/>
+    <w:bookmarkStart w:id="118" w:name="ref-liao2014"/>
     <w:p>
       <w:pPr>
         <w:pStyle w:val="Bibliography"/>
@@ -3749,7 +3760,7 @@
       <w:r>
         <w:t xml:space="preserve"> </w:t>
       </w:r>
-      <w:hyperlink r:id="rId116">
+      <w:hyperlink r:id="rId117">
         <w:r>
           <w:rPr>
             <w:rStyle w:val="Hyperlink"/>
@@ -3761,8 +3772,8 @@
         <w:t xml:space="preserve">. Bioinformatics. 2014;30(7):923–30</w:t>
       </w:r>
     </w:p>
-    <w:bookmarkEnd w:id="117"/>
-    <w:bookmarkStart w:id="119" w:name="ref-ma2014"/>
+    <w:bookmarkEnd w:id="118"/>
+    <w:bookmarkStart w:id="120" w:name="ref-ma2014"/>
     <w:p>
       <w:pPr>
         <w:pStyle w:val="Bibliography"/>
@@ -3773,7 +3784,7 @@
       <w:r>
         <w:t xml:space="preserve"> </w:t>
       </w:r>
-      <w:hyperlink r:id="rId118">
+      <w:hyperlink r:id="rId119">
         <w:r>
           <w:rPr>
             <w:rStyle w:val="Hyperlink"/>
@@ -3785,8 +3796,8 @@
         <w:t xml:space="preserve">. Journal of Virology. 2014;88(9):4786–97</w:t>
       </w:r>
     </w:p>
-    <w:bookmarkEnd w:id="119"/>
-    <w:bookmarkStart w:id="121" w:name="ref-oh2026"/>
+    <w:bookmarkEnd w:id="120"/>
+    <w:bookmarkStart w:id="122" w:name="ref-oh2026"/>
     <w:p>
       <w:pPr>
         <w:pStyle w:val="Bibliography"/>
@@ -3797,7 +3808,7 @@
       <w:r>
         <w:t xml:space="preserve"> </w:t>
       </w:r>
-      <w:hyperlink r:id="rId120">
+      <w:hyperlink r:id="rId121">
         <w:r>
           <w:rPr>
             <w:rStyle w:val="Hyperlink"/>
@@ -3809,8 +3820,8 @@
         <w:t xml:space="preserve">. JAMA Dermatology. 2026;162(5):509–14</w:t>
       </w:r>
     </w:p>
-    <w:bookmarkEnd w:id="121"/>
-    <w:bookmarkStart w:id="123" w:name="ref-purdie2005"/>
+    <w:bookmarkEnd w:id="122"/>
+    <w:bookmarkStart w:id="124" w:name="ref-purdie2005"/>
     <w:p>
       <w:pPr>
         <w:pStyle w:val="Bibliography"/>
@@ -3821,7 +3832,7 @@
       <w:r>
         <w:t xml:space="preserve"> </w:t>
       </w:r>
-      <w:hyperlink r:id="rId122">
+      <w:hyperlink r:id="rId123">
         <w:r>
           <w:rPr>
             <w:rStyle w:val="Hyperlink"/>
@@ -3833,8 +3844,8 @@
         <w:t xml:space="preserve">. Journal of Investigative Dermatology. 2005;125(1):98–107</w:t>
       </w:r>
     </w:p>
-    <w:bookmarkEnd w:id="123"/>
-    <w:bookmarkStart w:id="125" w:name="ref-rehm2022jvi"/>
+    <w:bookmarkEnd w:id="124"/>
+    <w:bookmarkStart w:id="126" w:name="ref-rehm2022jvi"/>
     <w:p>
       <w:pPr>
         <w:pStyle w:val="Bibliography"/>
@@ -3845,7 +3856,7 @@
       <w:r>
         <w:t xml:space="preserve"> </w:t>
       </w:r>
-      <w:hyperlink r:id="rId124">
+      <w:hyperlink r:id="rId125">
         <w:r>
           <w:rPr>
             <w:rStyle w:val="Hyperlink"/>
@@ -3899,8 +3910,8 @@
         <w:t xml:space="preserve">. Journal of Virology. 2022 a;96(23):e01498–22</w:t>
       </w:r>
     </w:p>
-    <w:bookmarkEnd w:id="125"/>
-    <w:bookmarkStart w:id="127" w:name="ref-rehm2022"/>
+    <w:bookmarkEnd w:id="126"/>
+    <w:bookmarkStart w:id="128" w:name="ref-rehm2022"/>
     <w:p>
       <w:pPr>
         <w:pStyle w:val="Bibliography"/>
@@ -3911,7 +3922,7 @@
       <w:r>
         <w:t xml:space="preserve"> </w:t>
       </w:r>
-      <w:hyperlink r:id="rId126">
+      <w:hyperlink r:id="rId127">
         <w:r>
           <w:rPr>
             <w:rStyle w:val="Hyperlink"/>
@@ -3923,8 +3934,8 @@
         <w:t xml:space="preserve">. Proceedings of the National Academy of Sciences. 2022 b;119(11):e2118930119</w:t>
       </w:r>
     </w:p>
-    <w:bookmarkEnd w:id="127"/>
-    <w:bookmarkStart w:id="129" w:name="ref-rollison2021"/>
+    <w:bookmarkEnd w:id="128"/>
+    <w:bookmarkStart w:id="130" w:name="ref-rollison2021"/>
     <w:p>
       <w:pPr>
         <w:pStyle w:val="Bibliography"/>
@@ -3935,7 +3946,7 @@
       <w:r>
         <w:t xml:space="preserve"> </w:t>
       </w:r>
-      <w:hyperlink r:id="rId128">
+      <w:hyperlink r:id="rId129">
         <w:r>
           <w:rPr>
             <w:rStyle w:val="Hyperlink"/>
@@ -3947,8 +3958,8 @@
         <w:t xml:space="preserve">. Cancer Research. 2021;81(17):4628–38</w:t>
       </w:r>
     </w:p>
-    <w:bookmarkEnd w:id="129"/>
-    <w:bookmarkStart w:id="131" w:name="ref-rollison2019sites"/>
+    <w:bookmarkEnd w:id="130"/>
+    <w:bookmarkStart w:id="132" w:name="ref-rollison2019sites"/>
     <w:p>
       <w:pPr>
         <w:pStyle w:val="Bibliography"/>
@@ -3959,7 +3970,7 @@
       <w:r>
         <w:t xml:space="preserve"> </w:t>
       </w:r>
-      <w:hyperlink r:id="rId130">
+      <w:hyperlink r:id="rId131">
         <w:r>
           <w:rPr>
             <w:rStyle w:val="Hyperlink"/>
@@ -3971,8 +3982,8 @@
         <w:t xml:space="preserve">. The Journal of Infectious Diseases. 2019 a;219(5):711–22</w:t>
       </w:r>
     </w:p>
-    <w:bookmarkEnd w:id="131"/>
-    <w:bookmarkStart w:id="133" w:name="ref-rollison2019"/>
+    <w:bookmarkEnd w:id="132"/>
+    <w:bookmarkStart w:id="134" w:name="ref-rollison2019"/>
     <w:p>
       <w:pPr>
         <w:pStyle w:val="Bibliography"/>
@@ -3983,7 +3994,7 @@
       <w:r>
         <w:t xml:space="preserve"> </w:t>
       </w:r>
-      <w:hyperlink r:id="rId132">
+      <w:hyperlink r:id="rId133">
         <w:r>
           <w:rPr>
             <w:rStyle w:val="Hyperlink"/>
@@ -3995,8 +4006,8 @@
         <w:t xml:space="preserve">. Journal of Virology. 2019 b;93(7):e01003–18</w:t>
       </w:r>
     </w:p>
-    <w:bookmarkEnd w:id="133"/>
-    <w:bookmarkStart w:id="135" w:name="ref-saeidian2023"/>
+    <w:bookmarkEnd w:id="134"/>
+    <w:bookmarkStart w:id="136" w:name="ref-saeidian2023"/>
     <w:p>
       <w:pPr>
         <w:pStyle w:val="Bibliography"/>
@@ -4007,7 +4018,7 @@
       <w:r>
         <w:t xml:space="preserve"> </w:t>
       </w:r>
-      <w:hyperlink r:id="rId134">
+      <w:hyperlink r:id="rId135">
         <w:r>
           <w:rPr>
             <w:rStyle w:val="Hyperlink"/>
@@ -4088,8 +4099,8 @@
         <w:t xml:space="preserve">. JCI Insight. 2023;8(5):e162558</w:t>
       </w:r>
     </w:p>
-    <w:bookmarkEnd w:id="135"/>
-    <w:bookmarkStart w:id="137" w:name="ref-sankovski2014"/>
+    <w:bookmarkEnd w:id="136"/>
+    <w:bookmarkStart w:id="138" w:name="ref-sankovski2014"/>
     <w:p>
       <w:pPr>
         <w:pStyle w:val="Bibliography"/>
@@ -4100,7 +4111,7 @@
       <w:r>
         <w:t xml:space="preserve"> </w:t>
       </w:r>
-      <w:hyperlink r:id="rId136">
+      <w:hyperlink r:id="rId137">
         <w:r>
           <w:rPr>
             <w:rStyle w:val="Hyperlink"/>
@@ -4112,8 +4123,8 @@
         <w:t xml:space="preserve">. Journal of Virology. 2014;88(2):961–73</w:t>
       </w:r>
     </w:p>
-    <w:bookmarkEnd w:id="137"/>
-    <w:bookmarkStart w:id="139" w:name="ref-selitsky2020"/>
+    <w:bookmarkEnd w:id="138"/>
+    <w:bookmarkStart w:id="140" w:name="ref-selitsky2020"/>
     <w:p>
       <w:pPr>
         <w:pStyle w:val="Bibliography"/>
@@ -4124,7 +4135,7 @@
       <w:r>
         <w:t xml:space="preserve"> </w:t>
       </w:r>
-      <w:hyperlink r:id="rId138">
+      <w:hyperlink r:id="rId139">
         <w:r>
           <w:rPr>
             <w:rStyle w:val="Hyperlink"/>
@@ -4166,8 +4177,8 @@
         <w:t xml:space="preserve">. BMC Genomics. 2020;21(1):79</w:t>
       </w:r>
     </w:p>
-    <w:bookmarkEnd w:id="139"/>
-    <w:bookmarkStart w:id="141" w:name="ref-shenpv2026"/>
+    <w:bookmarkEnd w:id="140"/>
+    <w:bookmarkStart w:id="142" w:name="ref-shenpv2026"/>
     <w:p>
       <w:pPr>
         <w:pStyle w:val="Bibliography"/>
@@ -4178,7 +4189,7 @@
       <w:r>
         <w:t xml:space="preserve"> </w:t>
       </w:r>
-      <w:hyperlink r:id="rId140">
+      <w:hyperlink r:id="rId141">
         <w:r>
           <w:rPr>
             <w:rStyle w:val="Hyperlink"/>
@@ -4190,8 +4201,8 @@
         <w:t xml:space="preserve">. bioRxiv. 2026;</w:t>
       </w:r>
     </w:p>
-    <w:bookmarkEnd w:id="141"/>
-    <w:bookmarkStart w:id="143" w:name="ref-shen2016"/>
+    <w:bookmarkEnd w:id="142"/>
+    <w:bookmarkStart w:id="144" w:name="ref-shen2016"/>
     <w:p>
       <w:pPr>
         <w:pStyle w:val="Bibliography"/>
@@ -4202,7 +4213,7 @@
       <w:r>
         <w:t xml:space="preserve"> </w:t>
       </w:r>
-      <w:hyperlink r:id="rId142">
+      <w:hyperlink r:id="rId143">
         <w:r>
           <w:rPr>
             <w:rStyle w:val="Hyperlink"/>
@@ -4244,8 +4255,8 @@
         <w:t xml:space="preserve">. PLoS ONE. 2016;11(10):e0163962</w:t>
       </w:r>
     </w:p>
-    <w:bookmarkEnd w:id="143"/>
-    <w:bookmarkStart w:id="145" w:name="ref-son2025"/>
+    <w:bookmarkEnd w:id="144"/>
+    <w:bookmarkStart w:id="146" w:name="ref-son2025"/>
     <w:p>
       <w:pPr>
         <w:pStyle w:val="Bibliography"/>
@@ -4256,7 +4267,7 @@
       <w:r>
         <w:t xml:space="preserve"> </w:t>
       </w:r>
-      <w:hyperlink r:id="rId144">
+      <w:hyperlink r:id="rId145">
         <w:r>
           <w:rPr>
             <w:rStyle w:val="Hyperlink"/>
@@ -4268,8 +4279,8 @@
         <w:t xml:space="preserve">. Cancer Cell. 2025;43(1):36–48.e10</w:t>
       </w:r>
     </w:p>
-    <w:bookmarkEnd w:id="145"/>
-    <w:bookmarkStart w:id="147" w:name="ref-strickley2019"/>
+    <w:bookmarkEnd w:id="146"/>
+    <w:bookmarkStart w:id="148" w:name="ref-strickley2019"/>
     <w:p>
       <w:pPr>
         <w:pStyle w:val="Bibliography"/>
@@ -4280,7 +4291,7 @@
       <w:r>
         <w:t xml:space="preserve"> </w:t>
       </w:r>
-      <w:hyperlink r:id="rId146">
+      <w:hyperlink r:id="rId147">
         <w:r>
           <w:rPr>
             <w:rStyle w:val="Hyperlink"/>
@@ -4292,8 +4303,8 @@
         <w:t xml:space="preserve">. Nature. 2019;575(7783):519–22</w:t>
       </w:r>
     </w:p>
-    <w:bookmarkEnd w:id="147"/>
-    <w:bookmarkStart w:id="149" w:name="ref-strickley2021"/>
+    <w:bookmarkEnd w:id="148"/>
+    <w:bookmarkStart w:id="150" w:name="ref-strickley2021"/>
     <w:p>
       <w:pPr>
         <w:pStyle w:val="Bibliography"/>
@@ -4304,7 +4315,7 @@
       <w:r>
         <w:t xml:space="preserve"> </w:t>
       </w:r>
-      <w:hyperlink r:id="rId148">
+      <w:hyperlink r:id="rId149">
         <w:r>
           <w:rPr>
             <w:rStyle w:val="Hyperlink"/>
@@ -4316,8 +4327,8 @@
         <w:t xml:space="preserve">. Nature. 2021;588(7838):E22–3</w:t>
       </w:r>
     </w:p>
-    <w:bookmarkEnd w:id="149"/>
-    <w:bookmarkStart w:id="151" w:name="ref-vandoorslaer2017"/>
+    <w:bookmarkEnd w:id="150"/>
+    <w:bookmarkStart w:id="152" w:name="ref-vandoorslaer2017"/>
     <w:p>
       <w:pPr>
         <w:pStyle w:val="Bibliography"/>
@@ -4328,7 +4339,7 @@
       <w:r>
         <w:t xml:space="preserve"> </w:t>
       </w:r>
-      <w:hyperlink r:id="rId150">
+      <w:hyperlink r:id="rId151">
         <w:r>
           <w:rPr>
             <w:rStyle w:val="Hyperlink"/>
@@ -4358,8 +4369,8 @@
         <w:t xml:space="preserve">. Nucleic Acids Research. 2017;45(D1):D499–506</w:t>
       </w:r>
     </w:p>
-    <w:bookmarkEnd w:id="151"/>
-    <w:bookmarkStart w:id="153" w:name="ref-vandiver2021"/>
+    <w:bookmarkEnd w:id="152"/>
+    <w:bookmarkStart w:id="154" w:name="ref-vandiver2021"/>
     <w:p>
       <w:pPr>
         <w:pStyle w:val="Bibliography"/>
@@ -4370,7 +4381,7 @@
       <w:r>
         <w:t xml:space="preserve"> </w:t>
       </w:r>
-      <w:hyperlink r:id="rId152">
+      <w:hyperlink r:id="rId153">
         <w:r>
           <w:rPr>
             <w:rStyle w:val="Hyperlink"/>
@@ -4406,8 +4417,8 @@
         <w:t xml:space="preserve">. Experimental Dermatology. 2021;30(11):1711–6</w:t>
       </w:r>
     </w:p>
-    <w:bookmarkEnd w:id="153"/>
-    <w:bookmarkStart w:id="155" w:name="ref-viarisio2018"/>
+    <w:bookmarkEnd w:id="154"/>
+    <w:bookmarkStart w:id="156" w:name="ref-viarisio2018"/>
     <w:p>
       <w:pPr>
         <w:pStyle w:val="Bibliography"/>
@@ -4418,7 +4429,7 @@
       <w:r>
         <w:t xml:space="preserve"> </w:t>
       </w:r>
-      <w:hyperlink r:id="rId154">
+      <w:hyperlink r:id="rId155">
         <w:r>
           <w:rPr>
             <w:rStyle w:val="Hyperlink"/>
@@ -4454,8 +4465,8 @@
         <w:t xml:space="preserve">. PLoS Pathogens. 2018;14(1):e1006783</w:t>
       </w:r>
     </w:p>
-    <w:bookmarkEnd w:id="155"/>
-    <w:bookmarkStart w:id="157" w:name="ref-weissenborn2012"/>
+    <w:bookmarkEnd w:id="156"/>
+    <w:bookmarkStart w:id="158" w:name="ref-weissenborn2012"/>
     <w:p>
       <w:pPr>
         <w:pStyle w:val="Bibliography"/>
@@ -4466,7 +4477,7 @@
       <w:r>
         <w:t xml:space="preserve"> </w:t>
       </w:r>
-      <w:hyperlink r:id="rId156">
+      <w:hyperlink r:id="rId157">
         <w:r>
           <w:rPr>
             <w:rStyle w:val="Hyperlink"/>
@@ -4502,8 +4513,8 @@
         <w:t xml:space="preserve">. Medical Microbiology and Immunology. 2012;201(2):117–25</w:t>
       </w:r>
     </w:p>
-    <w:bookmarkEnd w:id="157"/>
-    <w:bookmarkStart w:id="159" w:name="ref-wenande2025"/>
+    <w:bookmarkEnd w:id="158"/>
+    <w:bookmarkStart w:id="160" w:name="ref-wenande2025"/>
     <w:p>
       <w:pPr>
         <w:pStyle w:val="Bibliography"/>
@@ -4514,7 +4525,7 @@
       <w:r>
         <w:t xml:space="preserve"> </w:t>
       </w:r>
-      <w:hyperlink r:id="rId158">
+      <w:hyperlink r:id="rId159">
         <w:r>
           <w:rPr>
             <w:rStyle w:val="Hyperlink"/>
@@ -4550,8 +4561,8 @@
         <w:t xml:space="preserve">. JAMA Dermatology. 2025;161(6):605–14</w:t>
       </w:r>
     </w:p>
-    <w:bookmarkEnd w:id="159"/>
-    <w:bookmarkStart w:id="161" w:name="ref-wood2019"/>
+    <w:bookmarkEnd w:id="160"/>
+    <w:bookmarkStart w:id="162" w:name="ref-wood2019"/>
     <w:p>
       <w:pPr>
         <w:pStyle w:val="Bibliography"/>
@@ -4562,7 +4573,7 @@
       <w:r>
         <w:t xml:space="preserve"> </w:t>
       </w:r>
-      <w:hyperlink r:id="rId160">
+      <w:hyperlink r:id="rId161">
         <w:r>
           <w:rPr>
             <w:rStyle w:val="Hyperlink"/>
@@ -4586,10 +4597,10 @@
         <w:t xml:space="preserve">. Genome Biology. 2019;20:257</w:t>
       </w:r>
     </w:p>
-    <w:bookmarkEnd w:id="161"/>
     <w:bookmarkEnd w:id="162"/>
     <w:bookmarkEnd w:id="163"/>
-    <w:bookmarkStart w:id="209" w:name="supplementary-material"/>
+    <w:bookmarkEnd w:id="164"/>
+    <w:bookmarkStart w:id="210" w:name="supplementary-material"/>
     <w:p>
       <w:pPr>
         <w:pStyle w:val="Heading1"/>
@@ -4598,7 +4609,7 @@
         <w:t xml:space="preserve">Supplementary Material</w:t>
       </w:r>
     </w:p>
-    <w:bookmarkStart w:id="164" w:name="supplementary-materials-and-methods"/>
+    <w:bookmarkStart w:id="165" w:name="supplementary-materials-and-methods"/>
     <w:p>
       <w:pPr>
         <w:pStyle w:val="Heading2"/>
@@ -4607,8 +4618,8 @@
         <w:t xml:space="preserve">Supplementary Materials and Methods</w:t>
       </w:r>
     </w:p>
-    <w:bookmarkEnd w:id="164"/>
-    <w:bookmarkStart w:id="178" w:name="methods"/>
+    <w:bookmarkEnd w:id="165"/>
+    <w:bookmarkStart w:id="179" w:name="methods"/>
     <w:p>
       <w:pPr>
         <w:pStyle w:val="Heading2"/>
@@ -4617,7 +4628,7 @@
         <w:t xml:space="preserve">Methods</w:t>
       </w:r>
     </w:p>
-    <w:bookmarkStart w:id="165" w:name="overview-and-implementation"/>
+    <w:bookmarkStart w:id="166" w:name="overview-and-implementation"/>
     <w:p>
       <w:pPr>
         <w:pStyle w:val="Heading3"/>
@@ -4666,8 +4677,8 @@
         <w:t xml:space="preserve">The workflow comprises a one-time reference-construction stage followed by a per-sample pipeline: SRA discovery → FASTQ download → quality control → Kraken2 papillomavirus screen → branch on HPV status (only HPV-positive libraries proceed) → STAR alignment to the HPV reference panel → coverage-based HPV typing → early/late transcript classification → aggregation and reporting.</w:t>
       </w:r>
     </w:p>
-    <w:bookmarkEnd w:id="165"/>
-    <w:bookmarkStart w:id="166" w:name="hpv-reference-panel-and-kraken2-database"/>
+    <w:bookmarkEnd w:id="166"/>
+    <w:bookmarkStart w:id="167" w:name="hpv-reference-panel-and-kraken2-database"/>
     <w:p>
       <w:pPr>
         <w:pStyle w:val="Heading3"/>
@@ -4810,8 +4821,8 @@
         <w:t xml:space="preserve">) was constructed from the NCBI taxonomy and the human reference library (GRCh38), to which all panel HPV genomes were added under a Papillomaviridae taxon, so that human and HPV reads are jointly classified and HPV reads are resolved within the papillomavirus clade.</w:t>
       </w:r>
     </w:p>
-    <w:bookmarkEnd w:id="166"/>
-    <w:bookmarkStart w:id="167" w:name="dataset-assembly-and-sra-discovery"/>
+    <w:bookmarkEnd w:id="167"/>
+    <w:bookmarkStart w:id="168" w:name="dataset-assembly-and-sra-discovery"/>
     <w:p>
       <w:pPr>
         <w:pStyle w:val="Heading3"/>
@@ -4866,8 +4877,8 @@
         <w:t xml:space="preserve">. Library layout (single- vs paired-end) was taken from the SRA record. To enable robust downstream parsing, comma-containing free-text fields were retained in a raw samplesheet and stripped from the slim samplesheet consumed by the workflow.</w:t>
       </w:r>
     </w:p>
-    <w:bookmarkEnd w:id="167"/>
-    <w:bookmarkStart w:id="168" w:name="read-download-and-quality-control"/>
+    <w:bookmarkEnd w:id="168"/>
+    <w:bookmarkStart w:id="169" w:name="read-download-and-quality-control"/>
     <w:p>
       <w:pPr>
         <w:pStyle w:val="Heading3"/>
@@ -4977,8 +4988,8 @@
         <w:t xml:space="preserve">was run without a spot limit. This matters more than it may appear, because reads deposited from a coordinate-sorted alignment emerge from the SRA in reference order, which places unmapped, and therefore viral, reads at the end of the run; screening only the leading portion of such a library would miss the signal entirely and would do so non-randomly. As a check on the whole path from download to classification, the reads reaching the Kraken2 screen correspond to a median 98.6% of the SRA-reported spot count across the 10,834 screened libraries (5th percentile 85.5%), the small shortfall being fastp quality and length filtering, and the per-group medians span 95.8% to 99.5%, so no sample group was read less completely than another.</w:t>
       </w:r>
     </w:p>
-    <w:bookmarkEnd w:id="168"/>
-    <w:bookmarkStart w:id="169" w:name="hpv-screening-and-positivity-calling"/>
+    <w:bookmarkEnd w:id="169"/>
+    <w:bookmarkStart w:id="170" w:name="hpv-screening-and-positivity-calling"/>
     <w:p>
       <w:pPr>
         <w:pStyle w:val="Heading3"/>
@@ -5004,8 +5015,8 @@
         <w:t xml:space="preserve">), and HPV-negative otherwise; HPV-negative libraries were recorded for rate estimation but proceeded no further. HPV-classified reads from positive libraries were extracted (seqtk 1.4), keeping paired mates in register, for targeted alignment. This split, in which every screened library contributes to positivity rates but only positives advance to typing, is the central branch point of the workflow.</w:t>
       </w:r>
     </w:p>
-    <w:bookmarkEnd w:id="169"/>
-    <w:bookmarkStart w:id="170" w:name="hpv-typing"/>
+    <w:bookmarkEnd w:id="170"/>
+    <w:bookmarkStart w:id="171" w:name="hpv-typing"/>
     <w:p>
       <w:pPr>
         <w:pStyle w:val="Heading3"/>
@@ -5115,8 +5126,8 @@
         <w:t xml:space="preserve">); the full per-reference coverage table was retained regardless of assignment. The dual breadth-and-depth criterion guards against spurious assignment from a few reads piling up on a short, conserved region.</w:t>
       </w:r>
     </w:p>
-    <w:bookmarkEnd w:id="170"/>
-    <w:bookmarkStart w:id="171" w:name="earlylate-transcript-classification"/>
+    <w:bookmarkEnd w:id="171"/>
+    <w:bookmarkStart w:id="172" w:name="earlylate-transcript-classification"/>
     <w:p>
       <w:pPr>
         <w:pStyle w:val="Heading3"/>
@@ -5160,8 +5171,8 @@
         <w:t xml:space="preserve">). Productivity was gated on L1 specifically, rather than on combined L1+L2 signal, because L1 capsid expression is the more stringent marker of virion-producing late-stage infection, whereas isolated L2 signal can arise from low-level transcription or cross-mapping; this single rule was applied uniformly across all samples and run batches.</w:t>
       </w:r>
     </w:p>
-    <w:bookmarkEnd w:id="171"/>
-    <w:bookmarkStart w:id="172" w:name="Xb7b52261b13d214b61be4d17d32a361ca9d534d"/>
+    <w:bookmarkEnd w:id="172"/>
+    <w:bookmarkStart w:id="173" w:name="Xb7b52261b13d214b61be4d17d32a361ca9d534d"/>
     <w:p>
       <w:pPr>
         <w:pStyle w:val="Heading3"/>
@@ -5239,8 +5250,8 @@
         <w:t xml:space="preserve">annotations were treated as non-cell-line. These flags annotate rather than exclude samples, so that cell-line positives are retained as positive controls but can be separated from primary-tissue signal at analysis. For the prevalence-sweep cohort, study-level heuristic calls were additionally refined by manual curation through a structured workbook, with precedence sample &gt; study &gt; heuristic, and a provenance label recorded for each overridden call. As a further contaminant guard, low-coverage-breadth assignments (breadth &lt; 0.15) and alpha-genus/HPV16/HPV18 calls were tabulated by study to surface project-level contamination.</w:t>
       </w:r>
     </w:p>
-    <w:bookmarkEnd w:id="172"/>
-    <w:bookmarkStart w:id="173" w:name="X7eaa2f8331f5c25e50e9f6c362aa899cbb1292c"/>
+    <w:bookmarkEnd w:id="173"/>
+    <w:bookmarkStart w:id="174" w:name="X7eaa2f8331f5c25e50e9f6c362aa899cbb1292c"/>
     <w:p>
       <w:pPr>
         <w:pStyle w:val="Heading3"/>
@@ -5640,8 +5651,8 @@
         <w:t xml:space="preserve">).</w:t>
       </w:r>
     </w:p>
-    <w:bookmarkEnd w:id="173"/>
-    <w:bookmarkStart w:id="174" w:name="library-selection-chemistry"/>
+    <w:bookmarkEnd w:id="174"/>
+    <w:bookmarkStart w:id="175" w:name="library-selection-chemistry"/>
     <w:p>
       <w:pPr>
         <w:pStyle w:val="Heading3"/>
@@ -5810,8 +5821,8 @@
         <w:t xml:space="preserve">. Run as a blind test, the classifier recovers rRNA depletion for 15/15 of them from protocol text alone, which is also the independent confirmation that the series is rRNA-depleted rather than poly-A-selected.</w:t>
       </w:r>
     </w:p>
-    <w:bookmarkEnd w:id="174"/>
-    <w:bookmarkStart w:id="175" w:name="X092d6aa339a1e20488094a4b56c0474ffc2644c"/>
+    <w:bookmarkEnd w:id="175"/>
+    <w:bookmarkStart w:id="176" w:name="X092d6aa339a1e20488094a4b56c0474ffc2644c"/>
     <w:p>
       <w:pPr>
         <w:pStyle w:val="Heading3"/>
@@ -6142,8 +6153,8 @@
         <w:t xml:space="preserve">rather than downsampled.</w:t>
       </w:r>
     </w:p>
-    <w:bookmarkEnd w:id="175"/>
-    <w:bookmarkStart w:id="176" w:name="X100e545f3d9e395267e0fa4a0c685cbdafc7ff0"/>
+    <w:bookmarkEnd w:id="176"/>
+    <w:bookmarkStart w:id="177" w:name="X100e545f3d9e395267e0fa4a0c685cbdafc7ff0"/>
     <w:p>
       <w:pPr>
         <w:pStyle w:val="Heading3"/>
@@ -6326,8 +6337,8 @@
         <w:t xml:space="preserve">.</w:t>
       </w:r>
     </w:p>
-    <w:bookmarkEnd w:id="176"/>
-    <w:bookmarkStart w:id="177" w:name="execution-at-scale"/>
+    <w:bookmarkEnd w:id="177"/>
+    <w:bookmarkStart w:id="178" w:name="execution-at-scale"/>
     <w:p>
       <w:pPr>
         <w:pStyle w:val="Heading3"/>
@@ -6344,9 +6355,9 @@
         <w:t xml:space="preserve">For cohorts of thousands of libraries, a chunked driver processed the samplesheet in fixed-size batches (default 100 libraries per chunk). After each successful chunk, per-sample outputs (Kraken2 reports, HPV typing and transcript tables, and HPV status) were aggregated and the chunk’s working directory was deleted to bound disk use; a failed chunk was left intact for inspection and resumed on rerun. A single combined report was generated over the aggregated outputs at completion. Summary tables and figures were produced in R (tidyverse), and the depth-normalized burden analysis was implemented as a standalone R script operating on the aggregated Kraken2 reports, typing tables, and curated sample flags.</w:t>
       </w:r>
     </w:p>
-    <w:bookmarkEnd w:id="177"/>
     <w:bookmarkEnd w:id="178"/>
-    <w:bookmarkStart w:id="206" w:name="supplementary-figures-and-tables"/>
+    <w:bookmarkEnd w:id="179"/>
+    <w:bookmarkStart w:id="207" w:name="supplementary-figures-and-tables"/>
     <w:p>
       <w:pPr>
         <w:pStyle w:val="Heading2"/>
@@ -6368,7 +6379,7 @@
       <w:tr>
         <w:tc>
           <w:tcPr/>
-          <w:bookmarkStart w:id="182" w:name="suppfig-depth"/>
+          <w:bookmarkStart w:id="183" w:name="suppfig-depth"/>
           <w:p>
             <w:pPr>
               <w:pStyle w:val="Compact"/>
@@ -6379,18 +6390,18 @@
                 <wp:inline>
                   <wp:extent cx="5943600" cy="3714749"/>
                   <wp:effectExtent b="0" l="0" r="0" t="0"/>
-                  <wp:docPr descr="" title="" id="180" name="Picture"/>
+                  <wp:docPr descr="" title="" id="181" name="Picture"/>
                   <a:graphic>
                     <a:graphicData uri="http://schemas.openxmlformats.org/drawingml/2006/picture">
                       <pic:pic>
                         <pic:nvPicPr>
-                          <pic:cNvPr descr="figureS1.png" id="181" name="Picture"/>
+                          <pic:cNvPr descr="figureS1.png" id="182" name="Picture"/>
                           <pic:cNvPicPr>
                             <a:picLocks noChangeArrowheads="1" noChangeAspect="1"/>
                           </pic:cNvPicPr>
                         </pic:nvPicPr>
                         <pic:blipFill>
-                          <a:blip r:embed="rId179"/>
+                          <a:blip r:embed="rId180"/>
                           <a:stretch>
                             <a:fillRect/>
                           </a:stretch>
@@ -6447,7 +6458,7 @@
               <w:t xml:space="preserve">is not produced by differences in sequencing depth: the groups that reach the floor do so at every depth, and the groups that do not never reach it, however deeply sequenced. Point size is proportional to the number of libraries in each group × bin.</w:t>
             </w:r>
           </w:p>
-          <w:bookmarkEnd w:id="182"/>
+          <w:bookmarkEnd w:id="183"/>
         </w:tc>
       </w:tr>
     </w:tbl>
@@ -6472,7 +6483,7 @@
       <w:tr>
         <w:tc>
           <w:tcPr/>
-          <w:bookmarkStart w:id="186" w:name="suppfig-trace"/>
+          <w:bookmarkStart w:id="187" w:name="suppfig-trace"/>
           <w:p>
             <w:pPr>
               <w:pStyle w:val="Compact"/>
@@ -6483,18 +6494,18 @@
                 <wp:inline>
                   <wp:extent cx="5943600" cy="3302000"/>
                   <wp:effectExtent b="0" l="0" r="0" t="0"/>
-                  <wp:docPr descr="" title="" id="184" name="Picture"/>
+                  <wp:docPr descr="" title="" id="185" name="Picture"/>
                   <a:graphic>
                     <a:graphicData uri="http://schemas.openxmlformats.org/drawingml/2006/picture">
                       <pic:pic>
                         <pic:nvPicPr>
-                          <pic:cNvPr descr="figureS2.png" id="185" name="Picture"/>
+                          <pic:cNvPr descr="figureS2.png" id="186" name="Picture"/>
                           <pic:cNvPicPr>
                             <a:picLocks noChangeArrowheads="1" noChangeAspect="1"/>
                           </pic:cNvPicPr>
                         </pic:nvPicPr>
                         <pic:blipFill>
-                          <a:blip r:embed="rId183"/>
+                          <a:blip r:embed="rId184"/>
                           <a:stretch>
                             <a:fillRect/>
                           </a:stretch>
@@ -6563,7 +6574,7 @@
               <w:t xml:space="preserve">= 54), split into three exclusive classes from the per-gene read counts the pipeline already writes: libraries with no reads on any HPV gene, libraries with gene-mapped reads that do not reach the productive threshold, and productive libraries (L1 ≥ 3 reads). Cell-line and engineered libraries are excluded throughout. The classes are assigned in that order of precedence, so a library appears in exactly one. The residual sample group with no recorded site is not in the denominator: the claim is about skin and neoplasia. Of the 57 gene-mapped but non-productive trace libraries, 52 carry early-gene reads with the late program absent and 5 carry only L2 reads below the productive bar; the median late-read fraction across the whole trace is 0, against 0.367 in the controls, which is the differentiation-coupled capsid burst the controls are there to show.</w:t>
             </w:r>
           </w:p>
-          <w:bookmarkEnd w:id="186"/>
+          <w:bookmarkEnd w:id="187"/>
         </w:tc>
       </w:tr>
     </w:tbl>
@@ -6588,7 +6599,7 @@
       <w:tr>
         <w:tc>
           <w:tcPr/>
-          <w:bookmarkStart w:id="190" w:name="suppfig-types"/>
+          <w:bookmarkStart w:id="191" w:name="suppfig-types"/>
           <w:p>
             <w:pPr>
               <w:pStyle w:val="Compact"/>
@@ -6599,18 +6610,18 @@
                 <wp:inline>
                   <wp:extent cx="5943600" cy="2993813"/>
                   <wp:effectExtent b="0" l="0" r="0" t="0"/>
-                  <wp:docPr descr="" title="" id="188" name="Picture"/>
+                  <wp:docPr descr="" title="" id="189" name="Picture"/>
                   <a:graphic>
                     <a:graphicData uri="http://schemas.openxmlformats.org/drawingml/2006/picture">
                       <pic:pic>
                         <pic:nvPicPr>
-                          <pic:cNvPr descr="figureS3.png" id="189" name="Picture"/>
+                          <pic:cNvPr descr="figureS3.png" id="190" name="Picture"/>
                           <pic:cNvPicPr>
                             <a:picLocks noChangeArrowheads="1" noChangeAspect="1"/>
                           </pic:cNvPicPr>
                         </pic:nvPicPr>
                         <pic:blipFill>
-                          <a:blip r:embed="rId187"/>
+                          <a:blip r:embed="rId188"/>
                           <a:stretch>
                             <a:fillRect/>
                           </a:stretch>
@@ -6745,7 +6756,7 @@
               <w:t xml:space="preserve">collapses both panels from type to genus.</w:t>
             </w:r>
           </w:p>
-          <w:bookmarkEnd w:id="190"/>
+          <w:bookmarkEnd w:id="191"/>
         </w:tc>
       </w:tr>
     </w:tbl>
@@ -6770,7 +6781,7 @@
       <w:tr>
         <w:tc>
           <w:tcPr/>
-          <w:bookmarkStart w:id="194" w:name="suppfig-reservoir-gut"/>
+          <w:bookmarkStart w:id="195" w:name="suppfig-reservoir-gut"/>
           <w:p>
             <w:pPr>
               <w:pStyle w:val="Compact"/>
@@ -6781,18 +6792,18 @@
                 <wp:inline>
                   <wp:extent cx="5943600" cy="4302034"/>
                   <wp:effectExtent b="0" l="0" r="0" t="0"/>
-                  <wp:docPr descr="" title="" id="192" name="Picture"/>
+                  <wp:docPr descr="" title="" id="193" name="Picture"/>
                   <a:graphic>
                     <a:graphicData uri="http://schemas.openxmlformats.org/drawingml/2006/picture">
                       <pic:pic>
                         <pic:nvPicPr>
-                          <pic:cNvPr descr="figureS4.png" id="193" name="Picture"/>
+                          <pic:cNvPr descr="figureS4.png" id="194" name="Picture"/>
                           <pic:cNvPicPr>
                             <a:picLocks noChangeArrowheads="1" noChangeAspect="1"/>
                           </pic:cNvPicPr>
                         </pic:nvPicPr>
                         <pic:blipFill>
-                          <a:blip r:embed="rId191"/>
+                          <a:blip r:embed="rId192"/>
                           <a:stretch>
                             <a:fillRect/>
                           </a:stretch>
@@ -6932,7 +6943,7 @@
               <w:t xml:space="preserve">to be read as biology: the identical procedure applied to vaginal libraries recovers an overwhelmingly alpha mucosal niche, which assembly noise could not produce. Only skin is carried into the main figure, since the paper’s subject is skin. Its composition is a mixture of mucosal alpha (30.5%) and cutaneous beta (34.9%), and its commonest types interleave the two (HPV16, HPV6 and HPV56 with HPV24, HPV124 and HPV37), which is the expected signature of a collection route that crosses perianal skin rather than of papillomavirus carriage in the gut; the same pattern is seen independently in rectal-swab cohorts. Read that way the site is a useful control, since it shows the catalog recovering the genus of whatever epithelium the sampling route touches, and its novel-cluster fraction (9.6%) sits with skin’s (14.5%) rather than with the vaginal site’s (0.2%), as expected if its beta/gamma content is cutaneous in origin.</w:t>
             </w:r>
           </w:p>
-          <w:bookmarkEnd w:id="194"/>
+          <w:bookmarkEnd w:id="195"/>
         </w:tc>
       </w:tr>
     </w:tbl>
@@ -6957,7 +6968,7 @@
       <w:tr>
         <w:tc>
           <w:tcPr/>
-          <w:bookmarkStart w:id="198" w:name="suppfig-bayes"/>
+          <w:bookmarkStart w:id="199" w:name="suppfig-bayes"/>
           <w:p>
             <w:pPr>
               <w:pStyle w:val="Compact"/>
@@ -6968,18 +6979,18 @@
                 <wp:inline>
                   <wp:extent cx="5943600" cy="2905759"/>
                   <wp:effectExtent b="0" l="0" r="0" t="0"/>
-                  <wp:docPr descr="" title="" id="196" name="Picture"/>
+                  <wp:docPr descr="" title="" id="197" name="Picture"/>
                   <a:graphic>
                     <a:graphicData uri="http://schemas.openxmlformats.org/drawingml/2006/picture">
                       <pic:pic>
                         <pic:nvPicPr>
-                          <pic:cNvPr descr="figureS5.png" id="197" name="Picture"/>
+                          <pic:cNvPr descr="figureS5.png" id="198" name="Picture"/>
                           <pic:cNvPicPr>
                             <a:picLocks noChangeArrowheads="1" noChangeAspect="1"/>
                           </pic:cNvPicPr>
                         </pic:nvPicPr>
                         <pic:blipFill>
-                          <a:blip r:embed="rId195"/>
+                          <a:blip r:embed="rId196"/>
                           <a:stretch>
                             <a:fillRect/>
                           </a:stretch>
@@ -7057,7 +7068,7 @@
               <w:t xml:space="preserve">(3) row is the prior-sensitivity refit of the contrast immediately above it, reported in that table’s caption rather than as a row of its own, and it sits further from 1 rather than nearer, which is what makes the productive-controls gap a finding rather than an artifact of the Normal prior. The axis spans five orders of magnitude because that contrast genuinely does.</w:t>
             </w:r>
           </w:p>
-          <w:bookmarkEnd w:id="198"/>
+          <w:bookmarkEnd w:id="199"/>
         </w:tc>
       </w:tr>
     </w:tbl>
@@ -7082,7 +7093,7 @@
       <w:tr>
         <w:tc>
           <w:tcPr/>
-          <w:bookmarkStart w:id="199" w:name="supptbl-types"/>
+          <w:bookmarkStart w:id="200" w:name="supptbl-types"/>
           <w:tbl>
             <w:tblPr>
               <w:tblStyle w:val="Table"/>
@@ -9862,7 +9873,7 @@
               <w:t xml:space="preserve">, at the level of HPV genus.</w:t>
             </w:r>
           </w:p>
-          <w:bookmarkEnd w:id="199"/>
+          <w:bookmarkEnd w:id="200"/>
         </w:tc>
       </w:tr>
     </w:tbl>
@@ -9887,7 +9898,7 @@
       <w:tr>
         <w:tc>
           <w:tcPr/>
-          <w:bookmarkStart w:id="200" w:name="supptbl-productive"/>
+          <w:bookmarkStart w:id="201" w:name="supptbl-productive"/>
           <w:tbl>
             <w:tblPr>
               <w:tblStyle w:val="Table"/>
@@ -10574,7 +10585,7 @@
               <w:t xml:space="preserve">).</w:t>
             </w:r>
           </w:p>
-          <w:bookmarkEnd w:id="200"/>
+          <w:bookmarkEnd w:id="201"/>
         </w:tc>
       </w:tr>
     </w:tbl>
@@ -10599,7 +10610,7 @@
       <w:tr>
         <w:tc>
           <w:tcPr/>
-          <w:bookmarkStart w:id="201" w:name="supptbl-bayes"/>
+          <w:bookmarkStart w:id="202" w:name="supptbl-bayes"/>
           <w:tbl>
             <w:tblPr>
               <w:tblStyle w:val="Table"/>
@@ -11179,7 +11190,7 @@
               <w:t xml:space="preserve">(3) prior gives an even larger posterior OR, 14,515 [3,961, 77,562], confirming robustness). Sequencing depth is modeled per 10-fold (log₁₀) change in library size.</w:t>
             </w:r>
           </w:p>
-          <w:bookmarkEnd w:id="201"/>
+          <w:bookmarkEnd w:id="202"/>
         </w:tc>
       </w:tr>
     </w:tbl>
@@ -11204,7 +11215,7 @@
       <w:tr>
         <w:tc>
           <w:tcPr/>
-          <w:bookmarkStart w:id="202" w:name="supptbl-cin"/>
+          <w:bookmarkStart w:id="203" w:name="supptbl-cin"/>
           <w:tbl>
             <w:tblPr>
               <w:tblStyle w:val="Table"/>
@@ -11585,7 +11596,7 @@
               <w:t xml:space="preserve">= 0.0038). Retaining them is therefore the conservative analytical choice: the small floor-level excess of neoplasia over skin reported in the main text is an upper bound. Virus–host junction calling supports the same reading from an independent direction: the members of this set that carry enough viral reads to test are integration-positive, whereas the cutaneous-neoplasia libraries outside it are not. Integration is the expected state of mucosal HPV16 in carcinoma and is not a property of the cutaneous reservoir, so the assignment of these libraries to a mucosal origin rests on genome state as well as on type.</w:t>
             </w:r>
           </w:p>
-          <w:bookmarkEnd w:id="202"/>
+          <w:bookmarkEnd w:id="203"/>
         </w:tc>
       </w:tr>
     </w:tbl>
@@ -11610,7 +11621,7 @@
       <w:tr>
         <w:tc>
           <w:tcPr/>
-          <w:bookmarkStart w:id="203" w:name="supptbl-chem"/>
+          <w:bookmarkStart w:id="204" w:name="supptbl-chem"/>
           <w:tbl>
             <w:tblPr>
               <w:tblStyle w:val="Table"/>
@@ -12528,7 +12539,7 @@
               <w:t xml:space="preserve">= 7.2×10⁻¹²) and yields no above-floor library in either group.</w:t>
             </w:r>
           </w:p>
-          <w:bookmarkEnd w:id="203"/>
+          <w:bookmarkEnd w:id="204"/>
         </w:tc>
       </w:tr>
     </w:tbl>
@@ -12553,7 +12564,7 @@
       <w:tr>
         <w:tc>
           <w:tcPr/>
-          <w:bookmarkStart w:id="204" w:name="supptbl-trace"/>
+          <w:bookmarkStart w:id="205" w:name="supptbl-trace"/>
           <w:tbl>
             <w:tblPr>
               <w:tblStyle w:val="Table"/>
@@ -15258,7 +15269,7 @@
               <w:t xml:space="preserve">, from HPV type to HPV genus.</w:t>
             </w:r>
           </w:p>
-          <w:bookmarkEnd w:id="204"/>
+          <w:bookmarkEnd w:id="205"/>
         </w:tc>
       </w:tr>
     </w:tbl>
@@ -15283,7 +15294,7 @@
       <w:tr>
         <w:tc>
           <w:tcPr/>
-          <w:bookmarkStart w:id="205" w:name="supptbl-coinf"/>
+          <w:bookmarkStart w:id="206" w:name="supptbl-coinf"/>
           <w:tbl>
             <w:tblPr>
               <w:tblStyle w:val="Table"/>
@@ -16800,12 +16811,12 @@
               <w:t xml:space="preserve">, which retains only uniquely-mapped reads, since STAR assigns MAPQ ≤ 3 to any read placing equally well on two references, so cross-mapping between similar types cannot manufacture a co-infection call: each type in a row is supported by reads that map to it and to nothing else. Three cautions govern how far the table can be read. First, the rows are not independent observations: 13 of the 26 come from the paired studies SRP314958 (RNA-seq) and SRP314961 (MeRIP-seq), which are condyloma lesions from 5 donors (CA_1 to CA_5), each sequenced as an RNA-seq library plus a MeRIP input and IP fraction, so rows sharing a donor carry near-identical read profiles. Second, the secondary types often sit close to the threshold: across all non-dominant calls the median depth is 9.0× and 39% fall below 5×, so which type is called second can depend on the library fraction, and in donor CA_2 the RNA-seq and MeRIP input fractions call HPV6 + HPV11 while the IP fraction of the same specimen calls HPV6 + HPV42. Third, the deepest type in a co-infected library typically dominates its partner, by a median of 45-fold (interquartile range 14 to 2,175), so most rows describe one established infection alongside a minor second type rather than two comparable ones. Where both partners are unambiguous the pairings are biologically coherent: two carcinoma and actinic-keratosis libraries whose SRA records carry no tissue field (ERR2274877, ERR1971044) carry the beta-types HPV96 and HPV182 together at 98–99% breadth and 61–245× depth, and an EV biopsy (SRR21205038) carries the beta-types HPV20 and HPV9 at 18,558× and 736×; both are two full genomes in one library, not a genome plus a fragment. The most frequent pairing in the study is HPV11 with HPV42: 8 libraries carry both, against 14 with HPV11 alone and 1 with HPV42 alone. Requiring both partners to clear a stricter bar (breadth ≥ 0.70 and depth ≥ 5× for each) leaves 3 libraries from 1 of those donors (CA_1). Their dominance relation is asymmetric: HPV11 is the deeper type in all five condyloma lesions, exceeding HPV42 48- to 4,100-fold in the three with a strong HPV11 signal (CA_1, CA_4, CA_5) and 2- to 4-fold in the other two, so HPV42 is the minor partner throughout and clears the assignment threshold only where it happens to be abundant. Whether the pairing is a genuine dual infection or an artifact of that sensitivity limit cannot be settled from five donors of one study: it is a hypothesis the data motivate, not a result they support.</w:t>
             </w:r>
           </w:p>
-          <w:bookmarkEnd w:id="205"/>
+          <w:bookmarkEnd w:id="206"/>
         </w:tc>
       </w:tr>
     </w:tbl>
-    <w:bookmarkEnd w:id="206"/>
-    <w:bookmarkStart w:id="208" w:name="sec-s-crosstalk"/>
+    <w:bookmarkEnd w:id="207"/>
+    <w:bookmarkStart w:id="209" w:name="sec-s-crosstalk"/>
     <w:p>
       <w:pPr>
         <w:pStyle w:val="Heading2"/>
@@ -17035,7 +17046,7 @@
       <w:tr>
         <w:tc>
           <w:tcPr/>
-          <w:bookmarkStart w:id="207" w:name="supptbl-e2"/>
+          <w:bookmarkStart w:id="208" w:name="supptbl-e2"/>
           <w:tbl>
             <w:tblPr>
               <w:tblStyle w:val="Table"/>
@@ -17563,12 +17574,12 @@
               <w:t xml:space="preserve">against RefSeq papillomavirus open reading frames, and scored for whether E2 is present given that E1 is present. The comparison that matters is between the two right-hand columns and the two left-hand ones. Across all contigs, E2 recovery tracks assembly quality rather than biology: it is lowest in cervical CIN (79.3%) and cervical carcinoma (83.6%), which are also the arms with the shortest contigs, and highest in the vaginal and gut metagenomes, which assemble best. Once the question is restricted to near-complete contigs (≥7 kb), where E2 presence can actually be assessed, every category converges on 100%, and cervical carcinoma, in which integration and E2 disruption are the rule, returns 99.3% against 99.9% for skin. That convergence is not a biological result. An integrated genome cannot assemble across the virus-host junction, so conditioning on completeness selects episomal genomes in every category, and the statistic is structurally incapable of detecting the event it was built to detect. This table is reported because the inference is an inviting one to draw from a public contig catalog, and because it bounds what the DNA axis can contribute: presence of a papillomavirus in such a catalog is presence of a detectable L1, and carries no information about the state of the genome (Discussion).</w:t>
             </w:r>
           </w:p>
-          <w:bookmarkEnd w:id="207"/>
+          <w:bookmarkEnd w:id="208"/>
         </w:tc>
       </w:tr>
     </w:tbl>
-    <w:bookmarkEnd w:id="208"/>
     <w:bookmarkEnd w:id="209"/>
+    <w:bookmarkEnd w:id="210"/>
     <w:sectPr>
       <w:headerReference r:id="rId9" w:type="default"/>
       <w:pgSz w:h="15840" w:w="12240"/>

</xml_diff>

<commit_message>
manuscript: complete the CRediT statement and credit the grant holder
CRediT now carries lead/equal/supporting on every role, as JID requires.
Funding Acquisition is omitted because PRG2707 is held by Kristi Huik, who
is not an author; she is thanked in the Acknowledgments instead. The levels
are a draft and need sign-off from all three authors.

Co-Authored-By: Claude Opus 5 <noreply@anthropic.com>
</commit_message>
<xml_diff>
--- a/manuscript/manuscript_short.docx
+++ b/manuscript/manuscript_short.docx
@@ -2617,7 +2617,7 @@
         <w:pStyle w:val="FirstParagraph"/>
       </w:pPr>
       <w:r>
-        <w:t xml:space="preserve">This research was supported by the Estonian Research Council grant (PRG2707).</w:t>
+        <w:t xml:space="preserve">This research was supported by the Estonian Research Council grant PRG2707, held by Kristi Huik, whom we thank for supporting this work.</w:t>
       </w:r>
     </w:p>
     <w:p>
@@ -2651,7 +2651,7 @@
         <w:pStyle w:val="FirstParagraph"/>
       </w:pPr>
       <w:r>
-        <w:t xml:space="preserve">[To be completed, CRediT-compliant.] Conceptualization: AP; Data Curation: ; Formal Analysis: ; Funding Acquisition: ; Investigation: ; Methodology: ; Project Administration: ; Resources: ; Software: ; Supervision: ; Validation: AP; Visualization: ; Writing - Original Draft Preparation: ; Writing - Review and Editing: AP.</w:t>
+        <w:t xml:space="preserve">Conceptualization: MP (lead), AP (equal), TP (equal); Data Curation: TP (lead); Formal Analysis: TP (lead); Investigation: TP (lead); Methodology: TP (lead); Project Administration: TP (lead); Software: TP (lead); Supervision: MP (lead), AP (supporting); Validation: AP (lead), TP (supporting); Visualization: TP (lead); Writing - Original Draft Preparation: TP (lead); Writing - Review and Editing: AP (equal), MP (equal), TP (equal).</w:t>
       </w:r>
     </w:p>
     <w:bookmarkEnd w:id="61"/>

</xml_diff>